<commit_message>
Cambios realizados para 3erEntrega
Realice los cambios que nos pidio el profesor. Solamente queda pendiente ver lo de "Control de Cambios"
</commit_message>
<xml_diff>
--- a/Documentación/ProyectoIS 2026 CAJAL-FERNANDEZ_3raEntrega.docx
+++ b/Documentación/ProyectoIS 2026 CAJAL-FERNANDEZ_3raEntrega.docx
@@ -248,14 +248,34 @@
           <w:sz w:val="40"/>
           <w:szCs w:val="40"/>
         </w:rPr>
-        <w:t>DOCENTE:</w:t>
-      </w:r>
-      <w:r>
-        <w:rPr>
-          <w:rFonts w:ascii="Times New Roman" w:eastAsia="Times New Roman" w:hAnsi="Times New Roman" w:cs="Times New Roman"/>
+        <w:t>DOCENTE</w:t>
+      </w:r>
+      <w:r>
+        <w:rPr>
+          <w:rFonts w:ascii="Times New Roman" w:eastAsia="Times New Roman" w:hAnsi="Times New Roman" w:cs="Times New Roman"/>
+          <w:b/>
+          <w:bCs/>
           <w:sz w:val="40"/>
           <w:szCs w:val="40"/>
         </w:rPr>
+        <w:t>S</w:t>
+      </w:r>
+      <w:r>
+        <w:rPr>
+          <w:rFonts w:ascii="Times New Roman" w:eastAsia="Times New Roman" w:hAnsi="Times New Roman" w:cs="Times New Roman"/>
+          <w:b/>
+          <w:bCs/>
+          <w:sz w:val="40"/>
+          <w:szCs w:val="40"/>
+        </w:rPr>
+        <w:t>:</w:t>
+      </w:r>
+      <w:r>
+        <w:rPr>
+          <w:rFonts w:ascii="Times New Roman" w:eastAsia="Times New Roman" w:hAnsi="Times New Roman" w:cs="Times New Roman"/>
+          <w:sz w:val="40"/>
+          <w:szCs w:val="40"/>
+        </w:rPr>
         <w:t xml:space="preserve"> </w:t>
       </w:r>
       <w:r>
@@ -265,6 +285,14 @@
           <w:szCs w:val="36"/>
         </w:rPr>
         <w:t>Silva Juan Ignacio – Avila Jorge</w:t>
+      </w:r>
+      <w:r>
+        <w:rPr>
+          <w:rFonts w:ascii="Times New Roman" w:eastAsia="Times New Roman" w:hAnsi="Times New Roman" w:cs="Times New Roman"/>
+          <w:sz w:val="36"/>
+          <w:szCs w:val="36"/>
+        </w:rPr>
+        <w:t xml:space="preserve"> – Nicolas Esposito </w:t>
       </w:r>
     </w:p>
     <w:p>
@@ -7363,20 +7391,8 @@
                 <w:sz w:val="32"/>
                 <w:szCs w:val="32"/>
               </w:rPr>
-              <w:t xml:space="preserve">Entrega </w:t>
-            </w:r>
-            <w:proofErr w:type="spellStart"/>
-            <w:r>
-              <w:rPr>
-                <w:rFonts w:ascii="Times New Roman" w:eastAsia="Times New Roman" w:hAnsi="Times New Roman" w:cs="Times New Roman"/>
-                <w:b/>
-                <w:bCs/>
-                <w:sz w:val="32"/>
-                <w:szCs w:val="32"/>
-              </w:rPr>
-              <w:t>N°</w:t>
-            </w:r>
-            <w:proofErr w:type="spellEnd"/>
+              <w:t>Entrega N°</w:t>
+            </w:r>
           </w:p>
         </w:tc>
         <w:tc>
@@ -7402,20 +7418,8 @@
                 <w:sz w:val="32"/>
                 <w:szCs w:val="32"/>
               </w:rPr>
-              <w:t xml:space="preserve">Versión </w:t>
-            </w:r>
-            <w:proofErr w:type="spellStart"/>
-            <w:r>
-              <w:rPr>
-                <w:rFonts w:ascii="Times New Roman" w:eastAsia="Times New Roman" w:hAnsi="Times New Roman" w:cs="Times New Roman"/>
-                <w:b/>
-                <w:bCs/>
-                <w:sz w:val="32"/>
-                <w:szCs w:val="32"/>
-              </w:rPr>
-              <w:t>N°</w:t>
-            </w:r>
-            <w:proofErr w:type="spellEnd"/>
+              <w:t>Versión N°</w:t>
+            </w:r>
           </w:p>
         </w:tc>
         <w:tc>
@@ -7696,30 +7700,8 @@
               <w:rPr>
                 <w:rFonts w:ascii="Times New Roman" w:eastAsia="Times New Roman" w:hAnsi="Times New Roman" w:cs="Times New Roman"/>
               </w:rPr>
-              <w:t xml:space="preserve">. Cuando quiero modificar un producto que me muestre en los </w:t>
-            </w:r>
-            <w:proofErr w:type="spellStart"/>
-            <w:r>
-              <w:rPr>
-                <w:rFonts w:ascii="Times New Roman" w:eastAsia="Times New Roman" w:hAnsi="Times New Roman" w:cs="Times New Roman"/>
-              </w:rPr>
-              <w:t>textbox</w:t>
-            </w:r>
-            <w:proofErr w:type="spellEnd"/>
-            <w:r>
-              <w:rPr>
-                <w:rFonts w:ascii="Times New Roman" w:eastAsia="Times New Roman" w:hAnsi="Times New Roman" w:cs="Times New Roman"/>
-              </w:rPr>
-              <w:t xml:space="preserve"> todos los datos que ya están – Idem </w:t>
-            </w:r>
-            <w:proofErr w:type="spellStart"/>
-            <w:r>
-              <w:rPr>
-                <w:rFonts w:ascii="Times New Roman" w:eastAsia="Times New Roman" w:hAnsi="Times New Roman" w:cs="Times New Roman"/>
-              </w:rPr>
-              <w:t>frmUsuario</w:t>
-            </w:r>
-            <w:proofErr w:type="spellEnd"/>
+              <w:t>. Cuando quiero modificar un producto que me muestre en los textbox todos los datos que ya están – Idem frmUsuario</w:t>
+            </w:r>
           </w:p>
           <w:p>
             <w:pPr>
@@ -7994,17 +7976,8 @@
           <w:rFonts w:ascii="Times New Roman" w:eastAsia="Times New Roman" w:hAnsi="Times New Roman" w:cs="Times New Roman"/>
           <w:color w:val="000000"/>
         </w:rPr>
-        <w:t>Registro/</w:t>
-      </w:r>
-      <w:proofErr w:type="spellStart"/>
-      <w:r>
-        <w:rPr>
-          <w:rFonts w:ascii="Times New Roman" w:eastAsia="Times New Roman" w:hAnsi="Times New Roman" w:cs="Times New Roman"/>
-          <w:color w:val="000000"/>
-        </w:rPr>
-        <w:t>LogIn-Out</w:t>
-      </w:r>
-      <w:proofErr w:type="spellEnd"/>
+        <w:t>Registro/LogIn-Out</w:t>
+      </w:r>
       <w:r>
         <w:rPr>
           <w:rFonts w:ascii="Times New Roman" w:eastAsia="Times New Roman" w:hAnsi="Times New Roman" w:cs="Times New Roman"/>
@@ -8174,28 +8147,12 @@
           <w:rFonts w:ascii="Times New Roman" w:eastAsia="Times New Roman" w:hAnsi="Times New Roman" w:cs="Times New Roman"/>
         </w:rPr>
       </w:pPr>
-      <w:proofErr w:type="spellStart"/>
-      <w:r>
-        <w:rPr>
-          <w:rFonts w:ascii="Times New Roman" w:eastAsia="Times New Roman" w:hAnsi="Times New Roman" w:cs="Times New Roman"/>
-        </w:rPr>
-        <w:t>BackUp</w:t>
-      </w:r>
-      <w:proofErr w:type="spellEnd"/>
-      <w:r>
-        <w:rPr>
-          <w:rFonts w:ascii="Times New Roman" w:eastAsia="Times New Roman" w:hAnsi="Times New Roman" w:cs="Times New Roman"/>
-        </w:rPr>
-        <w:t xml:space="preserve"> y </w:t>
-      </w:r>
-      <w:proofErr w:type="spellStart"/>
-      <w:r>
-        <w:rPr>
-          <w:rFonts w:ascii="Times New Roman" w:eastAsia="Times New Roman" w:hAnsi="Times New Roman" w:cs="Times New Roman"/>
-        </w:rPr>
-        <w:t>Restore</w:t>
-      </w:r>
-      <w:proofErr w:type="spellEnd"/>
+      <w:r>
+        <w:rPr>
+          <w:rFonts w:ascii="Times New Roman" w:eastAsia="Times New Roman" w:hAnsi="Times New Roman" w:cs="Times New Roman"/>
+        </w:rPr>
+        <w:t>BackUp y Restore</w:t>
+      </w:r>
     </w:p>
     <w:p>
       <w:pPr>
@@ -8423,14 +8380,12 @@
                 <w:rFonts w:ascii="Times New Roman" w:hAnsi="Times New Roman" w:cs="Times New Roman"/>
               </w:rPr>
             </w:pPr>
-            <w:proofErr w:type="spellStart"/>
             <w:r>
               <w:rPr>
                 <w:rFonts w:ascii="Times New Roman" w:hAnsi="Times New Roman" w:cs="Times New Roman"/>
               </w:rPr>
               <w:t>Logout</w:t>
             </w:r>
-            <w:proofErr w:type="spellEnd"/>
           </w:p>
         </w:tc>
       </w:tr>
@@ -8450,7 +8405,19 @@
               <w:rPr>
                 <w:rFonts w:ascii="Times New Roman" w:hAnsi="Times New Roman" w:cs="Times New Roman"/>
               </w:rPr>
-              <w:t>“Gerente”</w:t>
+              <w:t>“</w:t>
+            </w:r>
+            <w:r>
+              <w:rPr>
+                <w:rFonts w:ascii="Times New Roman" w:hAnsi="Times New Roman" w:cs="Times New Roman"/>
+              </w:rPr>
+              <w:t>Administrador</w:t>
+            </w:r>
+            <w:r>
+              <w:rPr>
+                <w:rFonts w:ascii="Times New Roman" w:hAnsi="Times New Roman" w:cs="Times New Roman"/>
+              </w:rPr>
+              <w:t>”</w:t>
             </w:r>
           </w:p>
         </w:tc>
@@ -8544,126 +8511,12 @@
                 <w:rFonts w:ascii="Times New Roman" w:hAnsi="Times New Roman" w:cs="Times New Roman"/>
               </w:rPr>
             </w:pPr>
-            <w:proofErr w:type="spellStart"/>
             <w:r>
               <w:rPr>
                 <w:rFonts w:ascii="Times New Roman" w:hAnsi="Times New Roman" w:cs="Times New Roman"/>
               </w:rPr>
               <w:t>Logout</w:t>
             </w:r>
-            <w:proofErr w:type="spellEnd"/>
-          </w:p>
-        </w:tc>
-      </w:tr>
-      <w:tr>
-        <w:tc>
-          <w:tcPr>
-            <w:tcW w:w="4247" w:type="dxa"/>
-          </w:tcPr>
-          <w:p>
-            <w:pPr>
-              <w:jc w:val="center"/>
-              <w:rPr>
-                <w:rFonts w:ascii="Times New Roman" w:hAnsi="Times New Roman" w:cs="Times New Roman"/>
-              </w:rPr>
-            </w:pPr>
-            <w:r>
-              <w:rPr>
-                <w:rFonts w:ascii="Times New Roman" w:hAnsi="Times New Roman" w:cs="Times New Roman"/>
-              </w:rPr>
-              <w:t>“Administrador”</w:t>
-            </w:r>
-          </w:p>
-        </w:tc>
-        <w:tc>
-          <w:tcPr>
-            <w:tcW w:w="4247" w:type="dxa"/>
-          </w:tcPr>
-          <w:p>
-            <w:pPr>
-              <w:jc w:val="center"/>
-              <w:rPr>
-                <w:rFonts w:ascii="Times New Roman" w:hAnsi="Times New Roman" w:cs="Times New Roman"/>
-              </w:rPr>
-            </w:pPr>
-            <w:r>
-              <w:rPr>
-                <w:rFonts w:ascii="Times New Roman" w:hAnsi="Times New Roman" w:cs="Times New Roman"/>
-              </w:rPr>
-              <w:t>Login</w:t>
-            </w:r>
-          </w:p>
-          <w:p>
-            <w:pPr>
-              <w:jc w:val="center"/>
-              <w:rPr>
-                <w:rFonts w:ascii="Times New Roman" w:hAnsi="Times New Roman" w:cs="Times New Roman"/>
-              </w:rPr>
-            </w:pPr>
-            <w:r>
-              <w:rPr>
-                <w:rFonts w:ascii="Times New Roman" w:hAnsi="Times New Roman" w:cs="Times New Roman"/>
-              </w:rPr>
-              <w:t>Gestión Usuario</w:t>
-            </w:r>
-          </w:p>
-          <w:p>
-            <w:pPr>
-              <w:jc w:val="center"/>
-              <w:rPr>
-                <w:rFonts w:ascii="Times New Roman" w:hAnsi="Times New Roman" w:cs="Times New Roman"/>
-              </w:rPr>
-            </w:pPr>
-            <w:r>
-              <w:rPr>
-                <w:rFonts w:ascii="Times New Roman" w:hAnsi="Times New Roman" w:cs="Times New Roman"/>
-              </w:rPr>
-              <w:t>Gestión Producto</w:t>
-            </w:r>
-          </w:p>
-          <w:p>
-            <w:pPr>
-              <w:jc w:val="center"/>
-              <w:rPr>
-                <w:rFonts w:ascii="Times New Roman" w:hAnsi="Times New Roman" w:cs="Times New Roman"/>
-              </w:rPr>
-            </w:pPr>
-            <w:r>
-              <w:rPr>
-                <w:rFonts w:ascii="Times New Roman" w:hAnsi="Times New Roman" w:cs="Times New Roman"/>
-              </w:rPr>
-              <w:t>Gestión Idiomas</w:t>
-            </w:r>
-          </w:p>
-          <w:p>
-            <w:pPr>
-              <w:jc w:val="center"/>
-              <w:rPr>
-                <w:rFonts w:ascii="Times New Roman" w:hAnsi="Times New Roman" w:cs="Times New Roman"/>
-              </w:rPr>
-            </w:pPr>
-            <w:r>
-              <w:rPr>
-                <w:rFonts w:ascii="Times New Roman" w:hAnsi="Times New Roman" w:cs="Times New Roman"/>
-              </w:rPr>
-              <w:t>Administración</w:t>
-            </w:r>
-          </w:p>
-          <w:p>
-            <w:pPr>
-              <w:jc w:val="center"/>
-              <w:rPr>
-                <w:rFonts w:ascii="Times New Roman" w:hAnsi="Times New Roman" w:cs="Times New Roman"/>
-              </w:rPr>
-            </w:pPr>
-            <w:proofErr w:type="spellStart"/>
-            <w:r>
-              <w:rPr>
-                <w:rFonts w:ascii="Times New Roman" w:hAnsi="Times New Roman" w:cs="Times New Roman"/>
-              </w:rPr>
-              <w:t>Logout</w:t>
-            </w:r>
-            <w:proofErr w:type="spellEnd"/>
           </w:p>
         </w:tc>
       </w:tr>
@@ -9060,6 +8913,7 @@
           <w:bCs/>
           <w:color w:val="000000"/>
         </w:rPr>
+        <w:lastRenderedPageBreak/>
         <w:t>SERVICIO:</w:t>
       </w:r>
       <w:r>
@@ -9095,7 +8949,6 @@
         <w:rPr>
           <w:rFonts w:ascii="Times New Roman" w:eastAsia="Times New Roman" w:hAnsi="Times New Roman" w:cs="Times New Roman"/>
         </w:rPr>
-        <w:lastRenderedPageBreak/>
         <w:t>1.</w:t>
       </w:r>
       <w:r>
@@ -9360,7 +9213,6 @@
           <w:rFonts w:ascii="Times New Roman" w:hAnsi="Times New Roman" w:cs="Times New Roman"/>
           <w:noProof/>
         </w:rPr>
-        <w:lastRenderedPageBreak/>
         <w:drawing>
           <wp:anchor distT="0" distB="0" distL="114300" distR="114300" simplePos="0" relativeHeight="251658240" behindDoc="0" locked="0" layoutInCell="1" allowOverlap="1" wp14:anchorId="15D309E7" wp14:editId="10A0DBF9">
             <wp:simplePos x="0" y="0"/>
@@ -9541,7 +9393,6 @@
           <w:sz w:val="30"/>
           <w:szCs w:val="30"/>
         </w:rPr>
-        <w:lastRenderedPageBreak/>
         <w:t>1.</w:t>
       </w:r>
       <w:r>
@@ -10507,55 +10358,7 @@
           <w:rFonts w:ascii="Times New Roman" w:eastAsia="Times New Roman" w:hAnsi="Times New Roman" w:cs="Times New Roman"/>
           <w:color w:val="000000"/>
         </w:rPr>
-        <w:t xml:space="preserve">A su vez en la pantalla del </w:t>
-      </w:r>
-      <w:proofErr w:type="spellStart"/>
-      <w:r>
-        <w:rPr>
-          <w:rFonts w:ascii="Times New Roman" w:eastAsia="Times New Roman" w:hAnsi="Times New Roman" w:cs="Times New Roman"/>
-          <w:color w:val="000000"/>
-        </w:rPr>
-        <w:t>LogIn</w:t>
-      </w:r>
-      <w:proofErr w:type="spellEnd"/>
-      <w:r>
-        <w:rPr>
-          <w:rFonts w:ascii="Times New Roman" w:eastAsia="Times New Roman" w:hAnsi="Times New Roman" w:cs="Times New Roman"/>
-          <w:color w:val="000000"/>
-        </w:rPr>
-        <w:t xml:space="preserve"> presentamos un botón “mostrar” para que si el usuario quiere revisar la contraseña ingresada antes de presionar el botón </w:t>
-      </w:r>
-      <w:proofErr w:type="spellStart"/>
-      <w:r>
-        <w:rPr>
-          <w:rFonts w:ascii="Times New Roman" w:eastAsia="Times New Roman" w:hAnsi="Times New Roman" w:cs="Times New Roman"/>
-          <w:color w:val="000000"/>
-        </w:rPr>
-        <w:t>LogIn</w:t>
-      </w:r>
-      <w:proofErr w:type="spellEnd"/>
-      <w:r>
-        <w:rPr>
-          <w:rFonts w:ascii="Times New Roman" w:eastAsia="Times New Roman" w:hAnsi="Times New Roman" w:cs="Times New Roman"/>
-          <w:color w:val="000000"/>
-        </w:rPr>
-        <w:t xml:space="preserve"> pueda hacerlo. Para ello debemos setear la propiedad </w:t>
-      </w:r>
-      <w:proofErr w:type="spellStart"/>
-      <w:r>
-        <w:rPr>
-          <w:rFonts w:ascii="Times New Roman" w:eastAsia="Times New Roman" w:hAnsi="Times New Roman" w:cs="Times New Roman"/>
-          <w:color w:val="000000"/>
-        </w:rPr>
-        <w:t>PasswordChar</w:t>
-      </w:r>
-      <w:proofErr w:type="spellEnd"/>
-      <w:r>
-        <w:rPr>
-          <w:rFonts w:ascii="Times New Roman" w:eastAsia="Times New Roman" w:hAnsi="Times New Roman" w:cs="Times New Roman"/>
-          <w:color w:val="000000"/>
-        </w:rPr>
-        <w:t xml:space="preserve"> del TextBox en donde el usuario ingresa la contraseña como “*” por default.</w:t>
+        <w:t>A su vez en la pantalla del LogIn presentamos un botón “mostrar” para que si el usuario quiere revisar la contraseña ingresada antes de presionar el botón LogIn pueda hacerlo. Para ello debemos setear la propiedad PasswordChar del TextBox en donde el usuario ingresa la contraseña como “*” por default.</w:t>
       </w:r>
     </w:p>
     <w:p>
@@ -10626,27 +10429,7 @@
           <w:bCs/>
           <w:color w:val="000000"/>
         </w:rPr>
-        <w:t>Proceso de Log-</w:t>
-      </w:r>
-      <w:proofErr w:type="spellStart"/>
-      <w:r>
-        <w:rPr>
-          <w:rFonts w:ascii="Times New Roman" w:eastAsia="Times New Roman" w:hAnsi="Times New Roman" w:cs="Times New Roman"/>
-          <w:b/>
-          <w:bCs/>
-          <w:color w:val="000000"/>
-        </w:rPr>
-        <w:t>Out</w:t>
-      </w:r>
-      <w:proofErr w:type="spellEnd"/>
-      <w:r>
-        <w:rPr>
-          <w:rFonts w:ascii="Times New Roman" w:eastAsia="Times New Roman" w:hAnsi="Times New Roman" w:cs="Times New Roman"/>
-          <w:b/>
-          <w:bCs/>
-          <w:color w:val="000000"/>
-        </w:rPr>
-        <w:t>:</w:t>
+        <w:t>Proceso de Log-Out:</w:t>
       </w:r>
       <w:r>
         <w:rPr>
@@ -10674,37 +10457,9 @@
           <w:szCs w:val="30"/>
         </w:rPr>
         <w:lastRenderedPageBreak/>
-        <w:t xml:space="preserve">2.3 </w:t>
-      </w:r>
-      <w:proofErr w:type="spellStart"/>
-      <w:r>
-        <w:rPr>
-          <w:rFonts w:ascii="Times New Roman" w:eastAsia="Times New Roman" w:hAnsi="Times New Roman" w:cs="Times New Roman"/>
-          <w:sz w:val="30"/>
-          <w:szCs w:val="30"/>
-        </w:rPr>
-        <w:t>LogIn</w:t>
-      </w:r>
-      <w:proofErr w:type="spellEnd"/>
-      <w:r>
-        <w:rPr>
-          <w:rFonts w:ascii="Times New Roman" w:eastAsia="Times New Roman" w:hAnsi="Times New Roman" w:cs="Times New Roman"/>
-          <w:sz w:val="30"/>
-          <w:szCs w:val="30"/>
-        </w:rPr>
-        <w:t xml:space="preserve"> – CU001 </w:t>
-      </w:r>
-      <w:proofErr w:type="spellStart"/>
-      <w:r>
-        <w:rPr>
-          <w:rFonts w:ascii="Times New Roman" w:eastAsia="Times New Roman" w:hAnsi="Times New Roman" w:cs="Times New Roman"/>
-          <w:sz w:val="30"/>
-          <w:szCs w:val="30"/>
-        </w:rPr>
-        <w:t>LogIn</w:t>
+        <w:t>2.3 LogIn – CU001 LogIn</w:t>
       </w:r>
       <w:bookmarkEnd w:id="23"/>
-      <w:proofErr w:type="spellEnd"/>
     </w:p>
     <w:p>
       <w:pPr>
@@ -10730,14 +10485,7 @@
         <w:rPr>
           <w:rFonts w:ascii="Times New Roman" w:eastAsia="Times New Roman" w:hAnsi="Times New Roman" w:cs="Times New Roman"/>
         </w:rPr>
-        <w:t xml:space="preserve"> Diagrama </w:t>
-      </w:r>
-      <w:proofErr w:type="spellStart"/>
-      <w:r>
-        <w:rPr>
-          <w:rFonts w:ascii="Times New Roman" w:eastAsia="Times New Roman" w:hAnsi="Times New Roman" w:cs="Times New Roman"/>
-        </w:rPr>
-        <w:t>LogI</w:t>
+        <w:t xml:space="preserve"> Diagrama LogI</w:t>
       </w:r>
       <w:r>
         <w:rPr>
@@ -10746,7 +10494,6 @@
         <w:t>n</w:t>
       </w:r>
       <w:bookmarkEnd w:id="24"/>
-      <w:proofErr w:type="spellEnd"/>
     </w:p>
     <w:p>
       <w:pPr>
@@ -10889,17 +10636,8 @@
                 <w:rFonts w:ascii="Times New Roman" w:eastAsia="Times New Roman" w:hAnsi="Times New Roman" w:cs="Times New Roman"/>
                 <w:color w:val="000000"/>
               </w:rPr>
-              <w:t xml:space="preserve">CU 001 – </w:t>
-            </w:r>
-            <w:proofErr w:type="spellStart"/>
-            <w:r>
-              <w:rPr>
-                <w:rFonts w:ascii="Times New Roman" w:eastAsia="Times New Roman" w:hAnsi="Times New Roman" w:cs="Times New Roman"/>
-                <w:color w:val="000000"/>
-              </w:rPr>
-              <w:t>LogIn</w:t>
-            </w:r>
-            <w:proofErr w:type="spellEnd"/>
+              <w:t>CU 001 – LogIn</w:t>
+            </w:r>
             <w:r>
               <w:rPr>
                 <w:rFonts w:ascii="Times New Roman" w:eastAsia="Times New Roman" w:hAnsi="Times New Roman" w:cs="Times New Roman"/>
@@ -11314,27 +11052,7 @@
                 <w:sz w:val="22"/>
                 <w:szCs w:val="22"/>
               </w:rPr>
-              <w:t>El usuario ingresa al sistema y se le presenta la pantalla principal del mismo “</w:t>
-            </w:r>
-            <w:proofErr w:type="spellStart"/>
-            <w:r>
-              <w:rPr>
-                <w:rFonts w:ascii="Times New Roman" w:eastAsia="Times New Roman" w:hAnsi="Times New Roman" w:cs="Times New Roman"/>
-                <w:color w:val="000000"/>
-                <w:sz w:val="22"/>
-                <w:szCs w:val="22"/>
-              </w:rPr>
-              <w:t>LogIn</w:t>
-            </w:r>
-            <w:proofErr w:type="spellEnd"/>
-            <w:r>
-              <w:rPr>
-                <w:rFonts w:ascii="Times New Roman" w:eastAsia="Times New Roman" w:hAnsi="Times New Roman" w:cs="Times New Roman"/>
-                <w:color w:val="000000"/>
-                <w:sz w:val="22"/>
-                <w:szCs w:val="22"/>
-              </w:rPr>
-              <w:t>”.</w:t>
+              <w:t>El usuario ingresa al sistema y se le presenta la pantalla principal del mismo “LogIn”.</w:t>
             </w:r>
           </w:p>
           <w:p>
@@ -11759,6 +11477,7 @@
                 <w:bCs/>
                 <w:color w:val="000000"/>
               </w:rPr>
+              <w:lastRenderedPageBreak/>
               <w:t>5</w:t>
             </w:r>
             <w:r>
@@ -11793,7 +11512,6 @@
                 <w:b/>
                 <w:bCs/>
               </w:rPr>
-              <w:lastRenderedPageBreak/>
               <w:t>FA3- Usuario No Encontrado</w:t>
             </w:r>
           </w:p>
@@ -11912,23 +11630,7 @@
                 <w:rFonts w:ascii="Times New Roman" w:eastAsia="Times New Roman" w:hAnsi="Times New Roman" w:cs="Times New Roman"/>
                 <w:color w:val="000000"/>
               </w:rPr>
-              <w:t xml:space="preserve">El usuario queda autenticado en el sistema e inicia su sesión, se registran los permisos </w:t>
-            </w:r>
-            <w:proofErr w:type="gramStart"/>
-            <w:r>
-              <w:rPr>
-                <w:rFonts w:ascii="Times New Roman" w:eastAsia="Times New Roman" w:hAnsi="Times New Roman" w:cs="Times New Roman"/>
-                <w:color w:val="000000"/>
-              </w:rPr>
-              <w:t>del mismo</w:t>
-            </w:r>
-            <w:proofErr w:type="gramEnd"/>
-            <w:r>
-              <w:rPr>
-                <w:rFonts w:ascii="Times New Roman" w:eastAsia="Times New Roman" w:hAnsi="Times New Roman" w:cs="Times New Roman"/>
-                <w:color w:val="000000"/>
-              </w:rPr>
-              <w:t>.</w:t>
+              <w:t>El usuario queda autenticado en el sistema e inicia su sesión, se registran los permisos del mismo.</w:t>
             </w:r>
           </w:p>
         </w:tc>
@@ -12723,6 +12425,7 @@
                 <w:bCs/>
                 <w:color w:val="000000"/>
               </w:rPr>
+              <w:lastRenderedPageBreak/>
               <w:t xml:space="preserve">PRECONDICIONES: </w:t>
             </w:r>
             <w:r>
@@ -12769,7 +12472,6 @@
                 <w:bCs/>
                 <w:color w:val="000000"/>
               </w:rPr>
-              <w:lastRenderedPageBreak/>
               <w:t xml:space="preserve">PUNTOS DE EXTENSIÓN: </w:t>
             </w:r>
             <w:r>
@@ -13187,6 +12889,7 @@
         <w:rPr>
           <w:rFonts w:ascii="Times New Roman" w:eastAsia="Times New Roman" w:hAnsi="Times New Roman" w:cs="Times New Roman"/>
         </w:rPr>
+        <w:lastRenderedPageBreak/>
         <w:t>2.4.</w:t>
       </w:r>
       <w:r>
@@ -16810,6 +16513,7 @@
                 <w:bCs/>
                 <w:color w:val="000000"/>
               </w:rPr>
+              <w:lastRenderedPageBreak/>
               <w:t xml:space="preserve">PUNTOS DE EXTENSIÓN: </w:t>
             </w:r>
             <w:r>
@@ -16856,7 +16560,6 @@
                 <w:bCs/>
                 <w:color w:val="000000"/>
               </w:rPr>
-              <w:lastRenderedPageBreak/>
               <w:t>CONDICIÓN:</w:t>
             </w:r>
           </w:p>
@@ -17664,6 +17367,9 @@
     </w:p>
     <w:p>
       <w:r>
+        <w:rPr>
+          <w:noProof/>
+        </w:rPr>
         <w:drawing>
           <wp:inline distT="0" distB="0" distL="0" distR="0" wp14:anchorId="39EAF168" wp14:editId="08E7750F">
             <wp:extent cx="5400040" cy="2350770"/>
@@ -17827,21 +17533,7 @@
         <w:rPr>
           <w:rFonts w:ascii="Times New Roman" w:hAnsi="Times New Roman" w:cs="Times New Roman"/>
         </w:rPr>
-        <w:t xml:space="preserve">La utilización de la bitácora nos permite llevar un registro de las acciones realizadas dentro del sistema por parte de un usuario </w:t>
-      </w:r>
-      <w:proofErr w:type="gramStart"/>
-      <w:r>
-        <w:rPr>
-          <w:rFonts w:ascii="Times New Roman" w:hAnsi="Times New Roman" w:cs="Times New Roman"/>
-        </w:rPr>
-        <w:t>del mismo</w:t>
-      </w:r>
-      <w:proofErr w:type="gramEnd"/>
-      <w:r>
-        <w:rPr>
-          <w:rFonts w:ascii="Times New Roman" w:hAnsi="Times New Roman" w:cs="Times New Roman"/>
-        </w:rPr>
-        <w:t>. Cada evento registrado en la bitácora va a tener la fecha y hora en la que se realizó, el correo electrónico del usuario de quien la llevo a cabo, la actividad y la información asociada.</w:t>
+        <w:t>La utilización de la bitácora nos permite llevar un registro de las acciones realizadas dentro del sistema por parte de un usuario del mismo. Cada evento registrado en la bitácora va a tener la fecha y hora en la que se realizó, el correo electrónico del usuario de quien la llevo a cabo, la actividad y la información asociada.</w:t>
       </w:r>
     </w:p>
     <w:p>
@@ -17913,21 +17605,7 @@
         <w:rPr>
           <w:rFonts w:ascii="Times New Roman" w:hAnsi="Times New Roman" w:cs="Times New Roman"/>
         </w:rPr>
-        <w:t>Información asociada: Leyenda del hecho (Ej: El usuario “x</w:t>
-      </w:r>
-      <w:proofErr w:type="gramStart"/>
-      <w:r>
-        <w:rPr>
-          <w:rFonts w:ascii="Times New Roman" w:hAnsi="Times New Roman" w:cs="Times New Roman"/>
-        </w:rPr>
-        <w:t>”….</w:t>
-      </w:r>
-      <w:proofErr w:type="gramEnd"/>
-      <w:r>
-        <w:rPr>
-          <w:rFonts w:ascii="Times New Roman" w:hAnsi="Times New Roman" w:cs="Times New Roman"/>
-        </w:rPr>
-        <w:t>. tal actividad)</w:t>
+        <w:t>Información asociada: Leyenda del hecho (Ej: El usuario “x”….. tal actividad)</w:t>
       </w:r>
     </w:p>
     <w:p>
@@ -18432,21 +18110,7 @@
         <w:rPr>
           <w:rFonts w:ascii="Times New Roman" w:hAnsi="Times New Roman" w:cs="Times New Roman"/>
         </w:rPr>
-        <w:t xml:space="preserve">Con el objetivo de garantizar la seguridad de las contraseñas de los usuarios, en este proyecto se aplica el algoritmo SHA-256, encargado de transformar una cadena de texto en un valor de longitud determinado, denominado "hash". Este es un algoritmo de </w:t>
-      </w:r>
-      <w:proofErr w:type="spellStart"/>
-      <w:r>
-        <w:rPr>
-          <w:rFonts w:ascii="Times New Roman" w:hAnsi="Times New Roman" w:cs="Times New Roman"/>
-        </w:rPr>
-        <w:t>hashing</w:t>
-      </w:r>
-      <w:proofErr w:type="spellEnd"/>
-      <w:r>
-        <w:rPr>
-          <w:rFonts w:ascii="Times New Roman" w:hAnsi="Times New Roman" w:cs="Times New Roman"/>
-        </w:rPr>
-        <w:t xml:space="preserve"> unidireccional, lo que significa que no es posible desencriptar el hash para obtener la contraseña original. </w:t>
+        <w:t xml:space="preserve">Con el objetivo de garantizar la seguridad de las contraseñas de los usuarios, en este proyecto se aplica el algoritmo SHA-256, encargado de transformar una cadena de texto en un valor de longitud determinado, denominado "hash". Este es un algoritmo de hashing unidireccional, lo que significa que no es posible desencriptar el hash para obtener la contraseña original. </w:t>
       </w:r>
     </w:p>
     <w:p>
@@ -18459,35 +18123,7 @@
         <w:rPr>
           <w:rFonts w:ascii="Times New Roman" w:hAnsi="Times New Roman" w:cs="Times New Roman"/>
         </w:rPr>
-        <w:t xml:space="preserve">Tanto para la creación de usuarios como para el logueo en el sistema de estos mismos, se deberá ingresar una clave. Esta clave será </w:t>
-      </w:r>
-      <w:proofErr w:type="spellStart"/>
-      <w:r>
-        <w:rPr>
-          <w:rFonts w:ascii="Times New Roman" w:hAnsi="Times New Roman" w:cs="Times New Roman"/>
-        </w:rPr>
-        <w:t>hasheada</w:t>
-      </w:r>
-      <w:proofErr w:type="spellEnd"/>
-      <w:r>
-        <w:rPr>
-          <w:rFonts w:ascii="Times New Roman" w:hAnsi="Times New Roman" w:cs="Times New Roman"/>
-        </w:rPr>
-        <w:t xml:space="preserve"> por el algoritmo SHA-256 y será guardada en la base de datos. Un usuario que requiera iniciar sesión deberá ingresar su clave, en la interfaz de Inicio de sesión, el valor que coloque como clave, al seleccionar “Iniciar Sesión” será </w:t>
-      </w:r>
-      <w:proofErr w:type="spellStart"/>
-      <w:r>
-        <w:rPr>
-          <w:rFonts w:ascii="Times New Roman" w:hAnsi="Times New Roman" w:cs="Times New Roman"/>
-        </w:rPr>
-        <w:t>hasheado</w:t>
-      </w:r>
-      <w:proofErr w:type="spellEnd"/>
-      <w:r>
-        <w:rPr>
-          <w:rFonts w:ascii="Times New Roman" w:hAnsi="Times New Roman" w:cs="Times New Roman"/>
-        </w:rPr>
-        <w:t xml:space="preserve"> y comparado con el valor que se encuentre en la base de datos. Si estos valores coinciden, la sesión es iniciada, en el caso contrario donde no coincidan, se mostrará al usuario un error de contraseña incorrecta. </w:t>
+        <w:t xml:space="preserve">Tanto para la creación de usuarios como para el logueo en el sistema de estos mismos, se deberá ingresar una clave. Esta clave será hasheada por el algoritmo SHA-256 y será guardada en la base de datos. Un usuario que requiera iniciar sesión deberá ingresar su clave, en la interfaz de Inicio de sesión, el valor que coloque como clave, al seleccionar “Iniciar Sesión” será hasheado y comparado con el valor que se encuentre en la base de datos. Si estos valores coinciden, la sesión es iniciada, en el caso contrario donde no coincidan, se mostrará al usuario un error de contraseña incorrecta. </w:t>
       </w:r>
     </w:p>
     <w:p>
@@ -18509,25 +18145,7 @@
           <w:b/>
           <w:bCs/>
         </w:rPr>
-        <w:t xml:space="preserve">Método de la clase </w:t>
-      </w:r>
-      <w:proofErr w:type="spellStart"/>
-      <w:r>
-        <w:rPr>
-          <w:rFonts w:ascii="Times New Roman" w:hAnsi="Times New Roman" w:cs="Times New Roman"/>
-          <w:b/>
-          <w:bCs/>
-        </w:rPr>
-        <w:t>Encriptador</w:t>
-      </w:r>
-      <w:proofErr w:type="spellEnd"/>
-      <w:r>
-        <w:rPr>
-          <w:rFonts w:ascii="Times New Roman" w:hAnsi="Times New Roman" w:cs="Times New Roman"/>
-          <w:b/>
-          <w:bCs/>
-        </w:rPr>
-        <w:t xml:space="preserve">: </w:t>
+        <w:t xml:space="preserve">Método de la clase Encriptador: </w:t>
       </w:r>
     </w:p>
     <w:p>
@@ -18540,21 +18158,7 @@
         <w:rPr>
           <w:rFonts w:ascii="Times New Roman" w:hAnsi="Times New Roman" w:cs="Times New Roman"/>
         </w:rPr>
-        <w:t>Hash (</w:t>
-      </w:r>
-      <w:proofErr w:type="spellStart"/>
-      <w:r>
-        <w:rPr>
-          <w:rFonts w:ascii="Times New Roman" w:hAnsi="Times New Roman" w:cs="Times New Roman"/>
-        </w:rPr>
-        <w:t>string</w:t>
-      </w:r>
-      <w:proofErr w:type="spellEnd"/>
-      <w:r>
-        <w:rPr>
-          <w:rFonts w:ascii="Times New Roman" w:hAnsi="Times New Roman" w:cs="Times New Roman"/>
-        </w:rPr>
-        <w:t xml:space="preserve"> input): Este método toma una cadena de texto (como una contraseña en texto plano) y la convierte en un hash de 256 bits utilizando el algoritmo SHA-256. </w:t>
+        <w:t xml:space="preserve">Hash (string input): Este método toma una cadena de texto (como una contraseña en texto plano) y la convierte en un hash de 256 bits utilizando el algoritmo SHA-256. </w:t>
       </w:r>
     </w:p>
     <w:p>
@@ -18614,21 +18218,7 @@
         <w:rPr>
           <w:rFonts w:ascii="Times New Roman" w:hAnsi="Times New Roman" w:cs="Times New Roman"/>
         </w:rPr>
-        <w:t xml:space="preserve">Al momento de registrar un usuario en el sistema y completar la contraseña de este mismo, en la base de datos el campo que contiene la contraseña no será visible para la persona. Ej: Si la contraseña es Hola123, en la base de datos se </w:t>
-      </w:r>
-      <w:proofErr w:type="spellStart"/>
-      <w:r>
-        <w:rPr>
-          <w:rFonts w:ascii="Times New Roman" w:hAnsi="Times New Roman" w:cs="Times New Roman"/>
-        </w:rPr>
-        <w:t>vera</w:t>
-      </w:r>
-      <w:proofErr w:type="spellEnd"/>
-      <w:r>
-        <w:rPr>
-          <w:rFonts w:ascii="Times New Roman" w:hAnsi="Times New Roman" w:cs="Times New Roman"/>
-        </w:rPr>
-        <w:t xml:space="preserve"> de la siguiente manera: (Imagen ilustrativa de ejemplo)</w:t>
+        <w:t>Al momento de registrar un usuario en el sistema y completar la contraseña de este mismo, en la base de datos el campo que contiene la contraseña no será visible para la persona. Ej: Si la contraseña es Hola123, en la base de datos se vera de la siguiente manera: (Imagen ilustrativa de ejemplo)</w:t>
       </w:r>
     </w:p>
     <w:p>
@@ -20858,6 +20448,7 @@
                 <w:bCs/>
                 <w:color w:val="000000"/>
               </w:rPr>
+              <w:lastRenderedPageBreak/>
               <w:t xml:space="preserve">ACTOR PRINCIPAL: </w:t>
             </w:r>
             <w:r>
@@ -20904,7 +20495,6 @@
                 <w:bCs/>
                 <w:color w:val="000000"/>
               </w:rPr>
-              <w:lastRenderedPageBreak/>
               <w:t xml:space="preserve">ACTORES SECUNDARIOS: </w:t>
             </w:r>
             <w:r>
@@ -22101,6 +21691,7 @@
                 <w:bCs/>
                 <w:color w:val="000000"/>
               </w:rPr>
+              <w:lastRenderedPageBreak/>
               <w:t xml:space="preserve">DESCRIPCIÓN: </w:t>
             </w:r>
             <w:r>
@@ -22161,7 +21752,6 @@
                 <w:bCs/>
                 <w:color w:val="000000"/>
               </w:rPr>
-              <w:lastRenderedPageBreak/>
               <w:t xml:space="preserve">ACTOR PRINCIPAL: </w:t>
             </w:r>
             <w:r>
@@ -23220,6 +22810,7 @@
       <w:r>
         <w:rPr>
           <w:rFonts w:ascii="Times New Roman" w:eastAsia="Times New Roman" w:hAnsi="Times New Roman" w:cs="Times New Roman"/>
+          <w:noProof/>
           <w:sz w:val="30"/>
           <w:szCs w:val="30"/>
         </w:rPr>
@@ -23349,115 +22940,33 @@
         </w:rPr>
         <w:t xml:space="preserve">. El algoritmo realiza una suma ponderada donde cada carácter de cada atributo se multiplica por su posición dentro del valor y por la posición del atributo dentro de la entidad. Esto permite detectar no solo modificaciones en el contenido sino también intercambios de posición entre caracteres o atributos. Los atributos que participan en el cálculo son: </w:t>
       </w:r>
-      <w:proofErr w:type="spellStart"/>
       <w:r>
         <w:rPr>
           <w:rFonts w:ascii="Times New Roman" w:eastAsia="Times New Roman" w:hAnsi="Times New Roman" w:cs="Times New Roman"/>
           <w:color w:val="000000"/>
         </w:rPr>
-        <w:t>IdProducto</w:t>
-      </w:r>
-      <w:proofErr w:type="spellEnd"/>
+        <w:t xml:space="preserve">IdProducto, </w:t>
+      </w:r>
       <w:r>
         <w:rPr>
           <w:rFonts w:ascii="Times New Roman" w:eastAsia="Times New Roman" w:hAnsi="Times New Roman" w:cs="Times New Roman"/>
           <w:color w:val="000000"/>
         </w:rPr>
-        <w:t xml:space="preserve">, </w:t>
-      </w:r>
-      <w:proofErr w:type="spellStart"/>
+        <w:t xml:space="preserve">NombreProducto, PrecioProducto, TipoProducto, </w:t>
+      </w:r>
       <w:r>
         <w:rPr>
           <w:rFonts w:ascii="Times New Roman" w:eastAsia="Times New Roman" w:hAnsi="Times New Roman" w:cs="Times New Roman"/>
           <w:color w:val="000000"/>
         </w:rPr>
-        <w:t>NombreProducto</w:t>
-      </w:r>
-      <w:proofErr w:type="spellEnd"/>
+        <w:t>Descripción</w:t>
+      </w:r>
       <w:r>
         <w:rPr>
           <w:rFonts w:ascii="Times New Roman" w:eastAsia="Times New Roman" w:hAnsi="Times New Roman" w:cs="Times New Roman"/>
           <w:color w:val="000000"/>
         </w:rPr>
-        <w:t xml:space="preserve">, </w:t>
-      </w:r>
-      <w:proofErr w:type="spellStart"/>
-      <w:r>
-        <w:rPr>
-          <w:rFonts w:ascii="Times New Roman" w:eastAsia="Times New Roman" w:hAnsi="Times New Roman" w:cs="Times New Roman"/>
-          <w:color w:val="000000"/>
-        </w:rPr>
-        <w:t>PrecioProducto</w:t>
-      </w:r>
-      <w:proofErr w:type="spellEnd"/>
-      <w:r>
-        <w:rPr>
-          <w:rFonts w:ascii="Times New Roman" w:eastAsia="Times New Roman" w:hAnsi="Times New Roman" w:cs="Times New Roman"/>
-          <w:color w:val="000000"/>
-        </w:rPr>
-        <w:t xml:space="preserve">, </w:t>
-      </w:r>
-      <w:proofErr w:type="spellStart"/>
-      <w:r>
-        <w:rPr>
-          <w:rFonts w:ascii="Times New Roman" w:eastAsia="Times New Roman" w:hAnsi="Times New Roman" w:cs="Times New Roman"/>
-          <w:color w:val="000000"/>
-        </w:rPr>
-        <w:t>TipoProducto</w:t>
-      </w:r>
-      <w:proofErr w:type="spellEnd"/>
-      <w:r>
-        <w:rPr>
-          <w:rFonts w:ascii="Times New Roman" w:eastAsia="Times New Roman" w:hAnsi="Times New Roman" w:cs="Times New Roman"/>
-          <w:color w:val="000000"/>
-        </w:rPr>
-        <w:t xml:space="preserve">, </w:t>
-      </w:r>
-      <w:r>
-        <w:rPr>
-          <w:rFonts w:ascii="Times New Roman" w:eastAsia="Times New Roman" w:hAnsi="Times New Roman" w:cs="Times New Roman"/>
-          <w:color w:val="000000"/>
-        </w:rPr>
-        <w:t>Descripción</w:t>
-      </w:r>
-      <w:r>
-        <w:rPr>
-          <w:rFonts w:ascii="Times New Roman" w:eastAsia="Times New Roman" w:hAnsi="Times New Roman" w:cs="Times New Roman"/>
-          <w:color w:val="000000"/>
-        </w:rPr>
-        <w:t xml:space="preserve">, Cantidad y </w:t>
-      </w:r>
-      <w:proofErr w:type="spellStart"/>
-      <w:r>
-        <w:rPr>
-          <w:rFonts w:ascii="Times New Roman" w:eastAsia="Times New Roman" w:hAnsi="Times New Roman" w:cs="Times New Roman"/>
-          <w:color w:val="000000"/>
-        </w:rPr>
-        <w:t>CodigoProducto</w:t>
-      </w:r>
-      <w:proofErr w:type="spellEnd"/>
-      <w:r>
-        <w:rPr>
-          <w:rFonts w:ascii="Times New Roman" w:eastAsia="Times New Roman" w:hAnsi="Times New Roman" w:cs="Times New Roman"/>
-          <w:color w:val="000000"/>
-        </w:rPr>
-        <w:t xml:space="preserve">. El resultado de la suma se </w:t>
-      </w:r>
-      <w:proofErr w:type="spellStart"/>
-      <w:r>
-        <w:rPr>
-          <w:rFonts w:ascii="Times New Roman" w:eastAsia="Times New Roman" w:hAnsi="Times New Roman" w:cs="Times New Roman"/>
-          <w:color w:val="000000"/>
-        </w:rPr>
-        <w:t>hashea</w:t>
-      </w:r>
-      <w:proofErr w:type="spellEnd"/>
-      <w:r>
-        <w:rPr>
-          <w:rFonts w:ascii="Times New Roman" w:eastAsia="Times New Roman" w:hAnsi="Times New Roman" w:cs="Times New Roman"/>
-          <w:color w:val="000000"/>
-        </w:rPr>
-        <w:t xml:space="preserve"> con SHA-256 y se almacena en la columna DVH de la tabla PRODUCTO.</w:t>
+        <w:t>, Cantidad y CodigoProducto. El resultado de la suma se hashea con SHA-256 y se almacena en la columna DVH de la tabla PRODUCTO.</w:t>
       </w:r>
     </w:p>
     <w:p>
@@ -23479,23 +22988,7 @@
           <w:rFonts w:ascii="Times New Roman" w:eastAsia="Times New Roman" w:hAnsi="Times New Roman" w:cs="Times New Roman"/>
           <w:color w:val="000000"/>
         </w:rPr>
-        <w:t xml:space="preserve">El resultado de la suma se </w:t>
-      </w:r>
-      <w:proofErr w:type="spellStart"/>
-      <w:r>
-        <w:rPr>
-          <w:rFonts w:ascii="Times New Roman" w:eastAsia="Times New Roman" w:hAnsi="Times New Roman" w:cs="Times New Roman"/>
-          <w:color w:val="000000"/>
-        </w:rPr>
-        <w:t>hashea</w:t>
-      </w:r>
-      <w:proofErr w:type="spellEnd"/>
-      <w:r>
-        <w:rPr>
-          <w:rFonts w:ascii="Times New Roman" w:eastAsia="Times New Roman" w:hAnsi="Times New Roman" w:cs="Times New Roman"/>
-          <w:color w:val="000000"/>
-        </w:rPr>
-        <w:t xml:space="preserve"> con SHA-256 y se almacena en la tabla DIGITO_VERIFICADOR. </w:t>
+        <w:t xml:space="preserve">El resultado de la suma se hashea con SHA-256 y se almacena en la tabla DIGITO_VERIFICADOR. </w:t>
       </w:r>
       <w:r>
         <w:rPr>
@@ -23539,6 +23032,7 @@
           <w:bCs/>
           <w:color w:val="000000"/>
         </w:rPr>
+        <w:lastRenderedPageBreak/>
         <w:t>DVH:</w:t>
       </w:r>
       <w:r>
@@ -23546,39 +23040,7 @@
           <w:rFonts w:ascii="Times New Roman" w:eastAsia="Times New Roman" w:hAnsi="Times New Roman" w:cs="Times New Roman"/>
           <w:color w:val="000000"/>
         </w:rPr>
-        <w:t xml:space="preserve"> suma += ASCII(c) × </w:t>
-      </w:r>
-      <w:proofErr w:type="spellStart"/>
-      <w:r>
-        <w:rPr>
-          <w:rFonts w:ascii="Times New Roman" w:eastAsia="Times New Roman" w:hAnsi="Times New Roman" w:cs="Times New Roman"/>
-          <w:color w:val="000000"/>
-        </w:rPr>
-        <w:t>posChar</w:t>
-      </w:r>
-      <w:proofErr w:type="spellEnd"/>
-      <w:r>
-        <w:rPr>
-          <w:rFonts w:ascii="Times New Roman" w:eastAsia="Times New Roman" w:hAnsi="Times New Roman" w:cs="Times New Roman"/>
-          <w:color w:val="000000"/>
-        </w:rPr>
-        <w:t xml:space="preserve"> × </w:t>
-      </w:r>
-      <w:proofErr w:type="spellStart"/>
-      <w:r>
-        <w:rPr>
-          <w:rFonts w:ascii="Times New Roman" w:eastAsia="Times New Roman" w:hAnsi="Times New Roman" w:cs="Times New Roman"/>
-          <w:color w:val="000000"/>
-        </w:rPr>
-        <w:t>posAtributo</w:t>
-      </w:r>
-      <w:proofErr w:type="spellEnd"/>
-      <w:r>
-        <w:rPr>
-          <w:rFonts w:ascii="Times New Roman" w:eastAsia="Times New Roman" w:hAnsi="Times New Roman" w:cs="Times New Roman"/>
-          <w:color w:val="000000"/>
-        </w:rPr>
-        <w:t xml:space="preserve"> → SHA256(suma)</w:t>
+        <w:t xml:space="preserve"> suma += ASCII(c) × posChar × posAtributo → SHA256(suma)</w:t>
       </w:r>
     </w:p>
     <w:p>
@@ -23600,7 +23062,6 @@
           <w:bCs/>
           <w:color w:val="000000"/>
         </w:rPr>
-        <w:lastRenderedPageBreak/>
         <w:t>DVV:</w:t>
       </w:r>
       <w:r>
@@ -23608,39 +23069,7 @@
           <w:rFonts w:ascii="Times New Roman" w:eastAsia="Times New Roman" w:hAnsi="Times New Roman" w:cs="Times New Roman"/>
           <w:color w:val="000000"/>
         </w:rPr>
-        <w:t xml:space="preserve"> suma += ASCII(c) × </w:t>
-      </w:r>
-      <w:proofErr w:type="spellStart"/>
-      <w:r>
-        <w:rPr>
-          <w:rFonts w:ascii="Times New Roman" w:eastAsia="Times New Roman" w:hAnsi="Times New Roman" w:cs="Times New Roman"/>
-          <w:color w:val="000000"/>
-        </w:rPr>
-        <w:t>posChar</w:t>
-      </w:r>
-      <w:proofErr w:type="spellEnd"/>
-      <w:r>
-        <w:rPr>
-          <w:rFonts w:ascii="Times New Roman" w:eastAsia="Times New Roman" w:hAnsi="Times New Roman" w:cs="Times New Roman"/>
-          <w:color w:val="000000"/>
-        </w:rPr>
-        <w:t xml:space="preserve"> × </w:t>
-      </w:r>
-      <w:proofErr w:type="spellStart"/>
-      <w:r>
-        <w:rPr>
-          <w:rFonts w:ascii="Times New Roman" w:eastAsia="Times New Roman" w:hAnsi="Times New Roman" w:cs="Times New Roman"/>
-          <w:color w:val="000000"/>
-        </w:rPr>
-        <w:t>posFila</w:t>
-      </w:r>
-      <w:proofErr w:type="spellEnd"/>
-      <w:r>
-        <w:rPr>
-          <w:rFonts w:ascii="Times New Roman" w:eastAsia="Times New Roman" w:hAnsi="Times New Roman" w:cs="Times New Roman"/>
-          <w:color w:val="000000"/>
-        </w:rPr>
-        <w:t xml:space="preserve"> → SHA256(suma)</w:t>
+        <w:t xml:space="preserve"> suma += ASCII(c) × posChar × posFila → SHA256(suma)</w:t>
       </w:r>
     </w:p>
     <w:p>
@@ -23683,41 +23112,7 @@
           <w:rFonts w:ascii="Times New Roman" w:eastAsia="Times New Roman" w:hAnsi="Times New Roman" w:cs="Times New Roman"/>
           <w:color w:val="000000"/>
         </w:rPr>
-        <w:t xml:space="preserve">Al iniciar la aplicación, antes de mostrar el </w:t>
-      </w:r>
-      <w:proofErr w:type="spellStart"/>
-      <w:r>
-        <w:rPr>
-          <w:rFonts w:ascii="Times New Roman" w:eastAsia="Times New Roman" w:hAnsi="Times New Roman" w:cs="Times New Roman"/>
-          <w:color w:val="000000"/>
-        </w:rPr>
-        <w:t>login</w:t>
-      </w:r>
-      <w:proofErr w:type="spellEnd"/>
-      <w:r>
-        <w:rPr>
-          <w:rFonts w:ascii="Times New Roman" w:eastAsia="Times New Roman" w:hAnsi="Times New Roman" w:cs="Times New Roman"/>
-          <w:color w:val="000000"/>
-        </w:rPr>
-        <w:t xml:space="preserve">, se verifican ambos </w:t>
-      </w:r>
-      <w:proofErr w:type="spellStart"/>
-      <w:proofErr w:type="gramStart"/>
-      <w:r>
-        <w:rPr>
-          <w:rFonts w:ascii="Times New Roman" w:eastAsia="Times New Roman" w:hAnsi="Times New Roman" w:cs="Times New Roman"/>
-          <w:color w:val="000000"/>
-        </w:rPr>
-        <w:t>dígitos.En</w:t>
-      </w:r>
-      <w:proofErr w:type="spellEnd"/>
-      <w:proofErr w:type="gramEnd"/>
-      <w:r>
-        <w:rPr>
-          <w:rFonts w:ascii="Times New Roman" w:eastAsia="Times New Roman" w:hAnsi="Times New Roman" w:cs="Times New Roman"/>
-          <w:color w:val="000000"/>
-        </w:rPr>
-        <w:t xml:space="preserve"> caso de error se informa al </w:t>
+        <w:t xml:space="preserve">Al iniciar la aplicación, antes de mostrar el login, se verifican ambos dígitos.En caso de error se informa al </w:t>
       </w:r>
       <w:r>
         <w:rPr>
@@ -23792,23 +23187,7 @@
           <w:rFonts w:ascii="Times New Roman" w:eastAsia="Times New Roman" w:hAnsi="Times New Roman" w:cs="Times New Roman"/>
           <w:color w:val="000000"/>
         </w:rPr>
-        <w:t xml:space="preserve"> Restaura la base de datos completa desde un archivo .</w:t>
-      </w:r>
-      <w:proofErr w:type="spellStart"/>
-      <w:r>
-        <w:rPr>
-          <w:rFonts w:ascii="Times New Roman" w:eastAsia="Times New Roman" w:hAnsi="Times New Roman" w:cs="Times New Roman"/>
-          <w:color w:val="000000"/>
-        </w:rPr>
-        <w:t>bak</w:t>
-      </w:r>
-      <w:proofErr w:type="spellEnd"/>
-      <w:r>
-        <w:rPr>
-          <w:rFonts w:ascii="Times New Roman" w:eastAsia="Times New Roman" w:hAnsi="Times New Roman" w:cs="Times New Roman"/>
-          <w:color w:val="000000"/>
-        </w:rPr>
-        <w:t xml:space="preserve"> generado previamente</w:t>
+        <w:t xml:space="preserve"> Restaura la base de datos completa desde un archivo .bak generado previamente</w:t>
       </w:r>
       <w:r>
         <w:rPr>
@@ -23987,6 +23366,7 @@
           <w:sz w:val="30"/>
           <w:szCs w:val="30"/>
         </w:rPr>
+        <w:lastRenderedPageBreak/>
         <w:t>7.</w:t>
       </w:r>
       <w:r>
@@ -24078,7 +23458,6 @@
           <w:sz w:val="30"/>
           <w:szCs w:val="30"/>
         </w:rPr>
-        <w:lastRenderedPageBreak/>
         <w:t>7.5 Diagrama Secuencia del Sistema</w:t>
       </w:r>
       <w:r>
@@ -24413,117 +23792,21 @@
           <w:rFonts w:ascii="Times New Roman" w:eastAsia="Times New Roman" w:hAnsi="Times New Roman" w:cs="Times New Roman"/>
           <w:color w:val="000000"/>
         </w:rPr>
-        <w:t xml:space="preserve">El formulario </w:t>
-      </w:r>
-      <w:proofErr w:type="spellStart"/>
+        <w:t xml:space="preserve">El formulario BackUp-Restore permite al </w:t>
+      </w:r>
       <w:r>
         <w:rPr>
           <w:rFonts w:ascii="Times New Roman" w:eastAsia="Times New Roman" w:hAnsi="Times New Roman" w:cs="Times New Roman"/>
           <w:color w:val="000000"/>
         </w:rPr>
-        <w:t>BackUp-Restore</w:t>
-      </w:r>
-      <w:proofErr w:type="spellEnd"/>
+        <w:t>usuario</w:t>
+      </w:r>
       <w:r>
         <w:rPr>
           <w:rFonts w:ascii="Times New Roman" w:eastAsia="Times New Roman" w:hAnsi="Times New Roman" w:cs="Times New Roman"/>
           <w:color w:val="000000"/>
         </w:rPr>
-        <w:t xml:space="preserve"> permite al </w:t>
-      </w:r>
-      <w:r>
-        <w:rPr>
-          <w:rFonts w:ascii="Times New Roman" w:eastAsia="Times New Roman" w:hAnsi="Times New Roman" w:cs="Times New Roman"/>
-          <w:color w:val="000000"/>
-        </w:rPr>
-        <w:t>usuario</w:t>
-      </w:r>
-      <w:r>
-        <w:rPr>
-          <w:rFonts w:ascii="Times New Roman" w:eastAsia="Times New Roman" w:hAnsi="Times New Roman" w:cs="Times New Roman"/>
-          <w:color w:val="000000"/>
-        </w:rPr>
-        <w:t xml:space="preserve"> realizar cuatro operaciones: Crear </w:t>
-      </w:r>
-      <w:proofErr w:type="spellStart"/>
-      <w:r>
-        <w:rPr>
-          <w:rFonts w:ascii="Times New Roman" w:eastAsia="Times New Roman" w:hAnsi="Times New Roman" w:cs="Times New Roman"/>
-          <w:color w:val="000000"/>
-        </w:rPr>
-        <w:t>BackUp</w:t>
-      </w:r>
-      <w:proofErr w:type="spellEnd"/>
-      <w:r>
-        <w:rPr>
-          <w:rFonts w:ascii="Times New Roman" w:eastAsia="Times New Roman" w:hAnsi="Times New Roman" w:cs="Times New Roman"/>
-          <w:color w:val="000000"/>
-        </w:rPr>
-        <w:t xml:space="preserve"> genera un archivo .</w:t>
-      </w:r>
-      <w:proofErr w:type="spellStart"/>
-      <w:r>
-        <w:rPr>
-          <w:rFonts w:ascii="Times New Roman" w:eastAsia="Times New Roman" w:hAnsi="Times New Roman" w:cs="Times New Roman"/>
-          <w:color w:val="000000"/>
-        </w:rPr>
-        <w:t>bak</w:t>
-      </w:r>
-      <w:proofErr w:type="spellEnd"/>
-      <w:r>
-        <w:rPr>
-          <w:rFonts w:ascii="Times New Roman" w:eastAsia="Times New Roman" w:hAnsi="Times New Roman" w:cs="Times New Roman"/>
-          <w:color w:val="000000"/>
-        </w:rPr>
-        <w:t xml:space="preserve"> en la ruta especificada usando el SP </w:t>
-      </w:r>
-      <w:proofErr w:type="spellStart"/>
-      <w:r>
-        <w:rPr>
-          <w:rFonts w:ascii="Times New Roman" w:eastAsia="Times New Roman" w:hAnsi="Times New Roman" w:cs="Times New Roman"/>
-          <w:color w:val="000000"/>
-        </w:rPr>
-        <w:t>RealizarBackup</w:t>
-      </w:r>
-      <w:proofErr w:type="spellEnd"/>
-      <w:r>
-        <w:rPr>
-          <w:rFonts w:ascii="Times New Roman" w:eastAsia="Times New Roman" w:hAnsi="Times New Roman" w:cs="Times New Roman"/>
-          <w:color w:val="000000"/>
-        </w:rPr>
-        <w:t>. Restaurar Base restaura la base de datos completa desde un archivo .</w:t>
-      </w:r>
-      <w:proofErr w:type="spellStart"/>
-      <w:r>
-        <w:rPr>
-          <w:rFonts w:ascii="Times New Roman" w:eastAsia="Times New Roman" w:hAnsi="Times New Roman" w:cs="Times New Roman"/>
-          <w:color w:val="000000"/>
-        </w:rPr>
-        <w:t>bak</w:t>
-      </w:r>
-      <w:proofErr w:type="spellEnd"/>
-      <w:r>
-        <w:rPr>
-          <w:rFonts w:ascii="Times New Roman" w:eastAsia="Times New Roman" w:hAnsi="Times New Roman" w:cs="Times New Roman"/>
-          <w:color w:val="000000"/>
-        </w:rPr>
-        <w:t xml:space="preserve"> usando el SP </w:t>
-      </w:r>
-      <w:proofErr w:type="spellStart"/>
-      <w:r>
-        <w:rPr>
-          <w:rFonts w:ascii="Times New Roman" w:eastAsia="Times New Roman" w:hAnsi="Times New Roman" w:cs="Times New Roman"/>
-          <w:color w:val="000000"/>
-        </w:rPr>
-        <w:t>RealizarRestore</w:t>
-      </w:r>
-      <w:proofErr w:type="spellEnd"/>
-      <w:r>
-        <w:rPr>
-          <w:rFonts w:ascii="Times New Roman" w:eastAsia="Times New Roman" w:hAnsi="Times New Roman" w:cs="Times New Roman"/>
-          <w:color w:val="000000"/>
-        </w:rPr>
-        <w:t>. Ver Error DV ejecuta la verificación de integridad y muestra los errores encontrados. Solucionar Errores recalcula todos los DVH y DVV aceptando los datos actuales.</w:t>
+        <w:t xml:space="preserve"> realizar cuatro operaciones: Crear BackUp genera un archivo .bak en la ruta especificada usando el SP RealizarBackup. Restaurar Base restaura la base de datos completa desde un archivo .bak usando el SP RealizarRestore. Ver Error DV ejecuta la verificación de integridad y muestra los errores encontrados. Solucionar Errores recalcula todos los DVH y DVV aceptando los datos actuales.</w:t>
       </w:r>
     </w:p>
     <w:p>
@@ -24542,36 +23825,14 @@
           <w:color w:val="000000"/>
           <w:lang w:val="en-US"/>
         </w:rPr>
-        <w:t xml:space="preserve">Ruta </w:t>
-      </w:r>
-      <w:proofErr w:type="spellStart"/>
-      <w:r>
-        <w:rPr>
-          <w:rFonts w:ascii="Times New Roman" w:eastAsia="Times New Roman" w:hAnsi="Times New Roman" w:cs="Times New Roman"/>
-          <w:b/>
-          <w:bCs/>
+        <w:t>Ruta recomendada para backup:</w:t>
+      </w:r>
+      <w:r>
+        <w:rPr>
+          <w:rFonts w:ascii="Times New Roman" w:eastAsia="Times New Roman" w:hAnsi="Times New Roman" w:cs="Times New Roman"/>
           <w:color w:val="000000"/>
           <w:lang w:val="en-US"/>
         </w:rPr>
-        <w:t>recomendada</w:t>
-      </w:r>
-      <w:proofErr w:type="spellEnd"/>
-      <w:r>
-        <w:rPr>
-          <w:rFonts w:ascii="Times New Roman" w:eastAsia="Times New Roman" w:hAnsi="Times New Roman" w:cs="Times New Roman"/>
-          <w:b/>
-          <w:bCs/>
-          <w:color w:val="000000"/>
-          <w:lang w:val="en-US"/>
-        </w:rPr>
-        <w:t xml:space="preserve"> para backup:</w:t>
-      </w:r>
-      <w:r>
-        <w:rPr>
-          <w:rFonts w:ascii="Times New Roman" w:eastAsia="Times New Roman" w:hAnsi="Times New Roman" w:cs="Times New Roman"/>
-          <w:color w:val="000000"/>
-          <w:lang w:val="en-US"/>
-        </w:rPr>
         <w:t xml:space="preserve"> </w:t>
       </w:r>
       <w:r>
@@ -24580,18 +23841,8 @@
           <w:color w:val="0066FF"/>
           <w:lang w:val="en-US"/>
         </w:rPr>
-        <w:t>C:\Program Files\Microsoft SQL Server\MSSQL15.SQLEXPRESS\MSSQL\Backup\</w:t>
-      </w:r>
-      <w:proofErr w:type="spellStart"/>
-      <w:r>
-        <w:rPr>
-          <w:rFonts w:ascii="Times New Roman" w:eastAsia="Times New Roman" w:hAnsi="Times New Roman" w:cs="Times New Roman"/>
-          <w:color w:val="0066FF"/>
-          <w:lang w:val="en-US"/>
-        </w:rPr>
-        <w:t>NombreArchivo.bak</w:t>
-      </w:r>
-      <w:proofErr w:type="spellEnd"/>
+        <w:t>C:\Program Files\Microsoft SQL Server\MSSQL15.SQLEXPRESS\MSSQL\Backup\NombreArchivo.bak</w:t>
+      </w:r>
     </w:p>
     <w:p>
       <w:pPr>
@@ -24638,7 +23889,6 @@
         <w:rPr>
           <w:lang w:val="en-US"/>
         </w:rPr>
-        <w:lastRenderedPageBreak/>
         <w:t>Backup</w:t>
       </w:r>
     </w:p>
@@ -24736,12 +23986,9 @@
     <w:p/>
     <w:p/>
     <w:p>
-      <w:proofErr w:type="spellStart"/>
-      <w:r>
-        <w:lastRenderedPageBreak/>
+      <w:r>
         <w:t>Restore</w:t>
       </w:r>
-      <w:proofErr w:type="spellEnd"/>
     </w:p>
     <w:p>
       <w:r>
@@ -24852,27 +24099,11 @@
       <w:r>
         <w:t xml:space="preserve">lase base que define la interfaz común para permisos atómicos y compuestos. Contiene el método </w:t>
       </w:r>
-      <w:proofErr w:type="spellStart"/>
-      <w:proofErr w:type="gramStart"/>
       <w:r>
         <w:rPr>
           <w:rStyle w:val="CdigoHTML"/>
         </w:rPr>
-        <w:t>ContienePermiso</w:t>
-      </w:r>
-      <w:proofErr w:type="spellEnd"/>
-      <w:r>
-        <w:rPr>
-          <w:rStyle w:val="CdigoHTML"/>
-        </w:rPr>
-        <w:t>(</w:t>
-      </w:r>
-      <w:proofErr w:type="gramEnd"/>
-      <w:r>
-        <w:rPr>
-          <w:rStyle w:val="CdigoHTML"/>
-        </w:rPr>
-        <w:t>)</w:t>
+        <w:t>ContienePermiso()</w:t>
       </w:r>
       <w:r>
         <w:t xml:space="preserve"> que recorre recursivamente la jerarquía para verificar si un permiso existe dentro de la estructura.</w:t>
@@ -24899,23 +24130,7 @@
         <w:t>H</w:t>
       </w:r>
       <w:r>
-        <w:t>oja del árbol. Representa un permiso funcional específico del sistema (ej: "</w:t>
-      </w:r>
-      <w:proofErr w:type="spellStart"/>
-      <w:r>
-        <w:t>Gestion</w:t>
-      </w:r>
-      <w:proofErr w:type="spellEnd"/>
-      <w:r>
-        <w:t xml:space="preserve"> Usuarios", "</w:t>
-      </w:r>
-      <w:proofErr w:type="spellStart"/>
-      <w:r>
-        <w:t>Gestion</w:t>
-      </w:r>
-      <w:proofErr w:type="spellEnd"/>
-      <w:r>
-        <w:t xml:space="preserve"> Productos"). No puede tener hijos. Sus instancias están precargadas en la base de datos y no pueden ser creadas desde la interfaz.</w:t>
+        <w:t>oja del árbol. Representa un permiso funcional específico del sistema (ej: "Gestion Usuarios", "Gestion Productos"). No puede tener hijos. Sus instancias están precargadas en la base de datos y no pueden ser creadas desde la interfaz.</w:t>
       </w:r>
     </w:p>
     <w:p>
@@ -24940,41 +24155,7 @@
         <w:t>N</w:t>
       </w:r>
       <w:r>
-        <w:t xml:space="preserve">odo interno del árbol. Representa un rol que puede contener tanto permisos atómicos como otros roles. Tiene una lista de </w:t>
-      </w:r>
-      <w:proofErr w:type="spellStart"/>
-      <w:r>
-        <w:t>PermisosIncluidos</w:t>
-      </w:r>
-      <w:proofErr w:type="spellEnd"/>
-      <w:r>
-        <w:t xml:space="preserve"> y los métodos </w:t>
-      </w:r>
-      <w:proofErr w:type="spellStart"/>
-      <w:proofErr w:type="gramStart"/>
-      <w:r>
-        <w:t>AgregarPermiso</w:t>
-      </w:r>
-      <w:proofErr w:type="spellEnd"/>
-      <w:r>
-        <w:t>(</w:t>
-      </w:r>
-      <w:proofErr w:type="gramEnd"/>
-      <w:r>
-        <w:t xml:space="preserve">) y </w:t>
-      </w:r>
-      <w:proofErr w:type="spellStart"/>
-      <w:proofErr w:type="gramStart"/>
-      <w:r>
-        <w:t>QuitarPermiso</w:t>
-      </w:r>
-      <w:proofErr w:type="spellEnd"/>
-      <w:r>
-        <w:t>(</w:t>
-      </w:r>
-      <w:proofErr w:type="gramEnd"/>
-      <w:r>
-        <w:t>).</w:t>
+        <w:t>odo interno del árbol. Representa un rol que puede contener tanto permisos atómicos como otros roles. Tiene una lista de PermisosIncluidos y los métodos AgregarPermiso() y QuitarPermiso().</w:t>
       </w:r>
     </w:p>
     <w:p>
@@ -24996,7 +24177,6 @@
           <w:b/>
           <w:bCs/>
         </w:rPr>
-        <w:lastRenderedPageBreak/>
         <w:t>R</w:t>
       </w:r>
       <w:r>
@@ -25312,7 +24492,6 @@
         </w:rPr>
         <w:t xml:space="preserve"> </w:t>
       </w:r>
-      <w:proofErr w:type="spellStart"/>
       <w:r>
         <w:rPr>
           <w:rFonts w:ascii="Times New Roman" w:hAnsi="Times New Roman" w:cs="Times New Roman"/>
@@ -25320,7 +24499,6 @@
         </w:rPr>
         <w:t>river</w:t>
       </w:r>
-      <w:proofErr w:type="spellEnd"/>
     </w:p>
     <w:p>
       <w:pPr>
@@ -25362,7 +24540,6 @@
         </w:rPr>
         <w:t xml:space="preserve"> contraseña: </w:t>
       </w:r>
-      <w:proofErr w:type="spellStart"/>
       <w:r>
         <w:rPr>
           <w:rFonts w:ascii="Times New Roman" w:hAnsi="Times New Roman" w:cs="Times New Roman"/>
@@ -25370,7 +24547,6 @@
         </w:rPr>
         <w:t>rojoave</w:t>
       </w:r>
-      <w:proofErr w:type="spellEnd"/>
     </w:p>
     <w:p>
       <w:pPr>
@@ -25806,6 +24982,7 @@
           <w:sz w:val="30"/>
           <w:szCs w:val="30"/>
         </w:rPr>
+        <w:lastRenderedPageBreak/>
         <w:t>9.3 Der</w:t>
       </w:r>
       <w:bookmarkEnd w:id="97"/>
@@ -25881,7 +25058,6 @@
           <w:sz w:val="30"/>
           <w:szCs w:val="30"/>
         </w:rPr>
-        <w:lastRenderedPageBreak/>
         <w:t>9.</w:t>
       </w:r>
       <w:r>
@@ -25965,6 +25141,7 @@
         <w:rPr>
           <w:noProof/>
         </w:rPr>
+        <w:lastRenderedPageBreak/>
         <w:drawing>
           <wp:inline distT="0" distB="0" distL="0" distR="0" wp14:anchorId="67F6CEB9" wp14:editId="7987C52E">
             <wp:extent cx="5400040" cy="2538095"/>
@@ -26061,14 +25238,7 @@
         <w:rPr>
           <w:rFonts w:ascii="Times New Roman" w:eastAsia="Times New Roman" w:hAnsi="Times New Roman" w:cs="Times New Roman"/>
         </w:rPr>
-        <w:t xml:space="preserve">Utilizando el patrón Observer, cada componente visual que contenga leyendas o títulos se suscribirá a los cambios de idioma garantizando que, al realizar una modificación, </w:t>
-      </w:r>
-      <w:r>
-        <w:rPr>
-          <w:rFonts w:ascii="Times New Roman" w:eastAsia="Times New Roman" w:hAnsi="Times New Roman" w:cs="Times New Roman"/>
-        </w:rPr>
-        <w:lastRenderedPageBreak/>
-        <w:t>todas las interfaces se actualicen automáticamente sin necesidad de reiniciar la aplicación o recargar formularios. Esto mejora significativamente la usabilidad y accesibilidad del sistema, especialmente en entornos donde interactúan usuarios con diferentes lenguas.</w:t>
+        <w:t>Utilizando el patrón Observer, cada componente visual que contenga leyendas o títulos se suscribirá a los cambios de idioma garantizando que, al realizar una modificación, todas las interfaces se actualicen automáticamente sin necesidad de reiniciar la aplicación o recargar formularios. Esto mejora significativamente la usabilidad y accesibilidad del sistema, especialmente en entornos donde interactúan usuarios con diferentes lenguas.</w:t>
       </w:r>
     </w:p>
     <w:p>
@@ -26100,6 +25270,7 @@
           <w:sz w:val="30"/>
           <w:szCs w:val="30"/>
         </w:rPr>
+        <w:lastRenderedPageBreak/>
         <w:t xml:space="preserve">10.2 </w:t>
       </w:r>
       <w:r>
@@ -27121,23 +26292,7 @@
                 <w:rFonts w:asciiTheme="majorBidi" w:hAnsiTheme="majorBidi" w:cstheme="majorBidi"/>
                 <w:lang w:val="es-ES"/>
               </w:rPr>
-              <w:t xml:space="preserve"> El sistema muestra el nombre del control entre corchetes como </w:t>
-            </w:r>
-            <w:proofErr w:type="spellStart"/>
-            <w:r>
-              <w:rPr>
-                <w:rFonts w:asciiTheme="majorBidi" w:hAnsiTheme="majorBidi" w:cstheme="majorBidi"/>
-                <w:lang w:val="es-ES"/>
-              </w:rPr>
-              <w:t>fallback</w:t>
-            </w:r>
-            <w:proofErr w:type="spellEnd"/>
-            <w:r>
-              <w:rPr>
-                <w:rFonts w:asciiTheme="majorBidi" w:hAnsiTheme="majorBidi" w:cstheme="majorBidi"/>
-                <w:lang w:val="es-ES"/>
-              </w:rPr>
-              <w:t xml:space="preserve">. </w:t>
+              <w:t xml:space="preserve"> El sistema muestra el nombre del control entre corchetes como fallback. </w:t>
             </w:r>
             <w:r>
               <w:rPr>
@@ -27205,23 +26360,7 @@
                 <w:rFonts w:asciiTheme="majorBidi" w:hAnsiTheme="majorBidi" w:cstheme="majorBidi"/>
                 <w:lang w:val="es-ES"/>
               </w:rPr>
-              <w:t xml:space="preserve"> El sistema utiliza el texto en español entre corchetes como </w:t>
-            </w:r>
-            <w:proofErr w:type="spellStart"/>
-            <w:r>
-              <w:rPr>
-                <w:rFonts w:asciiTheme="majorBidi" w:hAnsiTheme="majorBidi" w:cstheme="majorBidi"/>
-                <w:lang w:val="es-ES"/>
-              </w:rPr>
-              <w:t>fallback</w:t>
-            </w:r>
-            <w:proofErr w:type="spellEnd"/>
-            <w:r>
-              <w:rPr>
-                <w:rFonts w:asciiTheme="majorBidi" w:hAnsiTheme="majorBidi" w:cstheme="majorBidi"/>
-                <w:lang w:val="es-ES"/>
-              </w:rPr>
-              <w:t xml:space="preserve"> según el COALESCE definido en la base de datos.</w:t>
+              <w:t xml:space="preserve"> El sistema utiliza el texto en español entre corchetes como fallback según el COALESCE definido en la base de datos.</w:t>
             </w:r>
             <w:r>
               <w:rPr>
@@ -27437,7 +26576,6 @@
           <w:sz w:val="30"/>
           <w:szCs w:val="30"/>
         </w:rPr>
-        <w:lastRenderedPageBreak/>
         <w:t>10.</w:t>
       </w:r>
       <w:r>
@@ -27993,13 +27131,23 @@
               <w:bCs/>
               <w:color w:val="000000"/>
             </w:rPr>
-            <w:t xml:space="preserve">Docente: </w:t>
+            <w:t>Docente</w:t>
           </w:r>
           <w:r>
             <w:rPr>
+              <w:b/>
+              <w:bCs/>
               <w:color w:val="000000"/>
             </w:rPr>
-            <w:t xml:space="preserve"> Silva Juan Ignacio</w:t>
+            <w:t>s</w:t>
+          </w:r>
+          <w:r>
+            <w:rPr>
+              <w:b/>
+              <w:bCs/>
+              <w:color w:val="000000"/>
+            </w:rPr>
+            <w:t xml:space="preserve">: </w:t>
           </w:r>
           <w:r>
             <w:rPr>
@@ -28030,7 +27178,37 @@
             <w:rPr>
               <w:color w:val="000000"/>
             </w:rPr>
+            <w:t>Silva Juan Ignacio</w:t>
+          </w:r>
+          <w:r>
+            <w:rPr>
+              <w:color w:val="000000"/>
+            </w:rPr>
+            <w:t xml:space="preserve"> </w:t>
+          </w:r>
+          <w:r>
+            <w:rPr>
+              <w:color w:val="000000"/>
+            </w:rPr>
+            <w:t xml:space="preserve"> </w:t>
+          </w:r>
+          <w:r>
+            <w:rPr>
+              <w:color w:val="000000"/>
+            </w:rPr>
+            <w:t xml:space="preserve">- </w:t>
+          </w:r>
+          <w:r>
+            <w:rPr>
+              <w:color w:val="000000"/>
+            </w:rPr>
             <w:t xml:space="preserve">Avila Javier  </w:t>
+          </w:r>
+          <w:r>
+            <w:rPr>
+              <w:color w:val="000000"/>
+            </w:rPr>
+            <w:t xml:space="preserve">- Nicolas Esposito </w:t>
           </w:r>
         </w:p>
       </w:tc>

</xml_diff>

<commit_message>
Cambios sumado a documentación
</commit_message>
<xml_diff>
--- a/Documentación/ProyectoIS 2026 CAJAL-FERNANDEZ_3raEntrega.docx
+++ b/Documentación/ProyectoIS 2026 CAJAL-FERNANDEZ_3raEntrega.docx
@@ -15727,7 +15727,25 @@
                 <w:sz w:val="22"/>
                 <w:szCs w:val="22"/>
               </w:rPr>
-              <w:t xml:space="preserve"> con un mensaje en pantalla “Baja exitosa”.</w:t>
+              <w:t xml:space="preserve"> con un mensaje en pantalla “</w:t>
+            </w:r>
+            <w:r>
+              <w:rPr>
+                <w:rFonts w:ascii="Times New Roman" w:eastAsia="Times New Roman" w:hAnsi="Times New Roman" w:cs="Times New Roman"/>
+                <w:color w:val="000000"/>
+                <w:sz w:val="22"/>
+                <w:szCs w:val="22"/>
+              </w:rPr>
+              <w:t>Usuario borrado exitosamente</w:t>
+            </w:r>
+            <w:r>
+              <w:rPr>
+                <w:rFonts w:ascii="Times New Roman" w:eastAsia="Times New Roman" w:hAnsi="Times New Roman" w:cs="Times New Roman"/>
+                <w:color w:val="000000"/>
+                <w:sz w:val="22"/>
+                <w:szCs w:val="22"/>
+              </w:rPr>
+              <w:t>”.</w:t>
             </w:r>
           </w:p>
         </w:tc>
@@ -16785,7 +16803,25 @@
                 <w:sz w:val="22"/>
                 <w:szCs w:val="22"/>
               </w:rPr>
-              <w:t xml:space="preserve">El sistema muestra un mensaje en pantalla “¿Confirma modificación de usuario?” </w:t>
+              <w:t xml:space="preserve">El sistema muestra un mensaje en pantalla “¿Confirma </w:t>
+            </w:r>
+            <w:r>
+              <w:rPr>
+                <w:rFonts w:ascii="Times New Roman" w:eastAsia="Times New Roman" w:hAnsi="Times New Roman" w:cs="Times New Roman"/>
+                <w:color w:val="000000"/>
+                <w:sz w:val="22"/>
+                <w:szCs w:val="22"/>
+              </w:rPr>
+              <w:t xml:space="preserve">la </w:t>
+            </w:r>
+            <w:r>
+              <w:rPr>
+                <w:rFonts w:ascii="Times New Roman" w:eastAsia="Times New Roman" w:hAnsi="Times New Roman" w:cs="Times New Roman"/>
+                <w:color w:val="000000"/>
+                <w:sz w:val="22"/>
+                <w:szCs w:val="22"/>
+              </w:rPr>
+              <w:t xml:space="preserve">modificación de usuario?” </w:t>
             </w:r>
           </w:p>
           <w:p>
@@ -16869,7 +16905,25 @@
                 <w:sz w:val="22"/>
                 <w:szCs w:val="22"/>
               </w:rPr>
-              <w:t xml:space="preserve"> con un mensaje en pantalla “Modificación exitosa”.</w:t>
+              <w:t xml:space="preserve"> con un mensaje en pantalla “</w:t>
+            </w:r>
+            <w:r>
+              <w:rPr>
+                <w:rFonts w:ascii="Times New Roman" w:eastAsia="Times New Roman" w:hAnsi="Times New Roman" w:cs="Times New Roman"/>
+                <w:color w:val="000000"/>
+                <w:sz w:val="22"/>
+                <w:szCs w:val="22"/>
+              </w:rPr>
+              <w:t>Usuario modificador correctamente</w:t>
+            </w:r>
+            <w:r>
+              <w:rPr>
+                <w:rFonts w:ascii="Times New Roman" w:eastAsia="Times New Roman" w:hAnsi="Times New Roman" w:cs="Times New Roman"/>
+                <w:color w:val="000000"/>
+                <w:sz w:val="22"/>
+                <w:szCs w:val="22"/>
+              </w:rPr>
+              <w:t>”.</w:t>
             </w:r>
           </w:p>
         </w:tc>
@@ -22300,7 +22354,43 @@
                 <w:sz w:val="22"/>
                 <w:szCs w:val="22"/>
               </w:rPr>
-              <w:t xml:space="preserve">El sistema muestra un mensaje en pantalla “¿Confirma modificación de producto?” </w:t>
+              <w:t xml:space="preserve">El sistema muestra un mensaje en pantalla “¿Confirma </w:t>
+            </w:r>
+            <w:r>
+              <w:rPr>
+                <w:rFonts w:ascii="Times New Roman" w:eastAsia="Times New Roman" w:hAnsi="Times New Roman" w:cs="Times New Roman"/>
+                <w:color w:val="000000"/>
+                <w:sz w:val="22"/>
+                <w:szCs w:val="22"/>
+              </w:rPr>
+              <w:t xml:space="preserve">la </w:t>
+            </w:r>
+            <w:r>
+              <w:rPr>
+                <w:rFonts w:ascii="Times New Roman" w:eastAsia="Times New Roman" w:hAnsi="Times New Roman" w:cs="Times New Roman"/>
+                <w:color w:val="000000"/>
+                <w:sz w:val="22"/>
+                <w:szCs w:val="22"/>
+              </w:rPr>
+              <w:t>modificación de</w:t>
+            </w:r>
+            <w:r>
+              <w:rPr>
+                <w:rFonts w:ascii="Times New Roman" w:eastAsia="Times New Roman" w:hAnsi="Times New Roman" w:cs="Times New Roman"/>
+                <w:color w:val="000000"/>
+                <w:sz w:val="22"/>
+                <w:szCs w:val="22"/>
+              </w:rPr>
+              <w:t>l</w:t>
+            </w:r>
+            <w:r>
+              <w:rPr>
+                <w:rFonts w:ascii="Times New Roman" w:eastAsia="Times New Roman" w:hAnsi="Times New Roman" w:cs="Times New Roman"/>
+                <w:color w:val="000000"/>
+                <w:sz w:val="22"/>
+                <w:szCs w:val="22"/>
+              </w:rPr>
+              <w:t xml:space="preserve"> producto?” </w:t>
             </w:r>
           </w:p>
           <w:p>
@@ -22366,7 +22456,25 @@
                 <w:sz w:val="22"/>
                 <w:szCs w:val="22"/>
               </w:rPr>
-              <w:t>El sistema informa al usuario con un mensaje en pantalla “Modificación exitosa”.</w:t>
+              <w:t>El sistema informa al usuario con un mensaje en pantalla “</w:t>
+            </w:r>
+            <w:r>
+              <w:rPr>
+                <w:rFonts w:ascii="Times New Roman" w:eastAsia="Times New Roman" w:hAnsi="Times New Roman" w:cs="Times New Roman"/>
+                <w:color w:val="000000"/>
+                <w:sz w:val="22"/>
+                <w:szCs w:val="22"/>
+              </w:rPr>
+              <w:t>Producto modificado correctamente</w:t>
+            </w:r>
+            <w:r>
+              <w:rPr>
+                <w:rFonts w:ascii="Times New Roman" w:eastAsia="Times New Roman" w:hAnsi="Times New Roman" w:cs="Times New Roman"/>
+                <w:color w:val="000000"/>
+                <w:sz w:val="22"/>
+                <w:szCs w:val="22"/>
+              </w:rPr>
+              <w:t>”.</w:t>
             </w:r>
           </w:p>
           <w:p>
@@ -23983,10 +24091,9 @@
     <w:p/>
     <w:p/>
     <w:p/>
-    <w:p/>
-    <w:p/>
     <w:p>
       <w:r>
+        <w:lastRenderedPageBreak/>
         <w:t>Restore</w:t>
       </w:r>
     </w:p>
@@ -24167,16 +24274,12 @@
       <w:pPr>
         <w:pStyle w:val="font-claude-response-body"/>
       </w:pPr>
-    </w:p>
-    <w:p>
-      <w:pPr>
-        <w:pStyle w:val="font-claude-response-body"/>
-      </w:pPr>
       <w:r>
         <w:rPr>
           <w:b/>
           <w:bCs/>
         </w:rPr>
+        <w:lastRenderedPageBreak/>
         <w:t>R</w:t>
       </w:r>
       <w:r>
@@ -24379,7 +24482,13 @@
         <w:rPr>
           <w:rFonts w:ascii="Times New Roman" w:hAnsi="Times New Roman" w:cs="Times New Roman"/>
         </w:rPr>
-        <w:t xml:space="preserve">Gerente &gt;&gt; </w:t>
+        <w:t>Administrador</w:t>
+      </w:r>
+      <w:r>
+        <w:rPr>
+          <w:rFonts w:ascii="Times New Roman" w:hAnsi="Times New Roman" w:cs="Times New Roman"/>
+        </w:rPr>
+        <w:t xml:space="preserve"> &gt;&gt; </w:t>
       </w:r>
       <w:hyperlink r:id="rId57" w:history="1">
         <w:r>
@@ -24750,10 +24859,10 @@
           <w:noProof/>
         </w:rPr>
         <w:drawing>
-          <wp:inline distT="0" distB="0" distL="0" distR="0" wp14:anchorId="137A5C20" wp14:editId="5F0CB956">
-            <wp:extent cx="6172186" cy="3147060"/>
-            <wp:effectExtent l="0" t="0" r="635" b="0"/>
-            <wp:docPr id="259351419" name="Imagen 1"/>
+          <wp:inline distT="0" distB="0" distL="0" distR="0" wp14:anchorId="1815D472" wp14:editId="18630D6C">
+            <wp:extent cx="5400040" cy="2770505"/>
+            <wp:effectExtent l="0" t="0" r="0" b="0"/>
+            <wp:docPr id="1589372602" name="Imagen 1"/>
             <wp:cNvGraphicFramePr>
               <a:graphicFrameLocks xmlns:a="http://schemas.openxmlformats.org/drawingml/2006/main" noChangeAspect="1"/>
             </wp:cNvGraphicFramePr>
@@ -24761,7 +24870,7 @@
               <a:graphicData uri="http://schemas.openxmlformats.org/drawingml/2006/picture">
                 <pic:pic xmlns:pic="http://schemas.openxmlformats.org/drawingml/2006/picture">
                   <pic:nvPicPr>
-                    <pic:cNvPr id="259351419" name=""/>
+                    <pic:cNvPr id="1589372602" name=""/>
                     <pic:cNvPicPr/>
                   </pic:nvPicPr>
                   <pic:blipFill>
@@ -24773,7 +24882,7 @@
                   <pic:spPr>
                     <a:xfrm>
                       <a:off x="0" y="0"/>
-                      <a:ext cx="6185897" cy="3154051"/>
+                      <a:ext cx="5400040" cy="2770505"/>
                     </a:xfrm>
                     <a:prstGeom prst="rect">
                       <a:avLst/>
@@ -25180,6 +25289,45 @@
       </w:r>
     </w:p>
     <w:p>
+      <w:r>
+        <w:drawing>
+          <wp:inline distT="0" distB="0" distL="0" distR="0" wp14:anchorId="688E84D1" wp14:editId="2285ED58">
+            <wp:extent cx="5400040" cy="2425700"/>
+            <wp:effectExtent l="0" t="0" r="0" b="0"/>
+            <wp:docPr id="491825088" name="Imagen 1"/>
+            <wp:cNvGraphicFramePr>
+              <a:graphicFrameLocks xmlns:a="http://schemas.openxmlformats.org/drawingml/2006/main" noChangeAspect="1"/>
+            </wp:cNvGraphicFramePr>
+            <a:graphic xmlns:a="http://schemas.openxmlformats.org/drawingml/2006/main">
+              <a:graphicData uri="http://schemas.openxmlformats.org/drawingml/2006/picture">
+                <pic:pic xmlns:pic="http://schemas.openxmlformats.org/drawingml/2006/picture">
+                  <pic:nvPicPr>
+                    <pic:cNvPr id="491825088" name=""/>
+                    <pic:cNvPicPr/>
+                  </pic:nvPicPr>
+                  <pic:blipFill>
+                    <a:blip r:embed="rId67"/>
+                    <a:stretch>
+                      <a:fillRect/>
+                    </a:stretch>
+                  </pic:blipFill>
+                  <pic:spPr>
+                    <a:xfrm>
+                      <a:off x="0" y="0"/>
+                      <a:ext cx="5400040" cy="2425700"/>
+                    </a:xfrm>
+                    <a:prstGeom prst="rect">
+                      <a:avLst/>
+                    </a:prstGeom>
+                  </pic:spPr>
+                </pic:pic>
+              </a:graphicData>
+            </a:graphic>
+          </wp:inline>
+        </w:drawing>
+      </w:r>
+    </w:p>
+    <w:p>
       <w:pPr>
         <w:pStyle w:val="Ttulo1"/>
         <w:rPr>
@@ -25238,7 +25386,14 @@
         <w:rPr>
           <w:rFonts w:ascii="Times New Roman" w:eastAsia="Times New Roman" w:hAnsi="Times New Roman" w:cs="Times New Roman"/>
         </w:rPr>
-        <w:t>Utilizando el patrón Observer, cada componente visual que contenga leyendas o títulos se suscribirá a los cambios de idioma garantizando que, al realizar una modificación, todas las interfaces se actualicen automáticamente sin necesidad de reiniciar la aplicación o recargar formularios. Esto mejora significativamente la usabilidad y accesibilidad del sistema, especialmente en entornos donde interactúan usuarios con diferentes lenguas.</w:t>
+        <w:t xml:space="preserve">Utilizando el patrón Observer, cada componente visual que contenga leyendas o títulos se suscribirá a los cambios de idioma garantizando que, al realizar una modificación, todas las interfaces se actualicen automáticamente sin necesidad de reiniciar la </w:t>
+      </w:r>
+      <w:r>
+        <w:rPr>
+          <w:rFonts w:ascii="Times New Roman" w:eastAsia="Times New Roman" w:hAnsi="Times New Roman" w:cs="Times New Roman"/>
+        </w:rPr>
+        <w:lastRenderedPageBreak/>
+        <w:t>aplicación o recargar formularios. Esto mejora significativamente la usabilidad y accesibilidad del sistema, especialmente en entornos donde interactúan usuarios con diferentes lenguas.</w:t>
       </w:r>
     </w:p>
     <w:p>
@@ -25270,7 +25425,6 @@
           <w:sz w:val="30"/>
           <w:szCs w:val="30"/>
         </w:rPr>
-        <w:lastRenderedPageBreak/>
         <w:t xml:space="preserve">10.2 </w:t>
       </w:r>
       <w:r>
@@ -25320,7 +25474,7 @@
                     </pic:cNvPicPr>
                   </pic:nvPicPr>
                   <pic:blipFill>
-                    <a:blip r:embed="rId67">
+                    <a:blip r:embed="rId68">
                       <a:extLst>
                         <a:ext uri="{28A0092B-C50C-407E-A947-70E740481C1C}">
                           <a14:useLocalDpi xmlns:a14="http://schemas.microsoft.com/office/drawing/2010/main" val="0"/>
@@ -25421,7 +25575,7 @@
                     </pic:cNvPicPr>
                   </pic:nvPicPr>
                   <pic:blipFill>
-                    <a:blip r:embed="rId68">
+                    <a:blip r:embed="rId69">
                       <a:extLst>
                         <a:ext uri="{28A0092B-C50C-407E-A947-70E740481C1C}">
                           <a14:useLocalDpi xmlns:a14="http://schemas.microsoft.com/office/drawing/2010/main" val="0"/>
@@ -25570,7 +25724,7 @@
                     </pic:cNvPicPr>
                   </pic:nvPicPr>
                   <pic:blipFill>
-                    <a:blip r:embed="rId69">
+                    <a:blip r:embed="rId70">
                       <a:extLst>
                         <a:ext uri="{28A0092B-C50C-407E-A947-70E740481C1C}">
                           <a14:useLocalDpi xmlns:a14="http://schemas.microsoft.com/office/drawing/2010/main" val="0"/>
@@ -26509,7 +26663,7 @@
                     </pic:cNvPicPr>
                   </pic:nvPicPr>
                   <pic:blipFill>
-                    <a:blip r:embed="rId70">
+                    <a:blip r:embed="rId71">
                       <a:extLst>
                         <a:ext uri="{28A0092B-C50C-407E-A947-70E740481C1C}">
                           <a14:useLocalDpi xmlns:a14="http://schemas.microsoft.com/office/drawing/2010/main" val="0"/>
@@ -26553,29 +26707,20 @@
     </w:p>
     <w:p>
       <w:pPr>
-        <w:rPr>
-          <w:rFonts w:ascii="Times New Roman" w:eastAsia="Times New Roman" w:hAnsi="Times New Roman" w:cs="Times New Roman"/>
-          <w:color w:val="0F4761"/>
+        <w:pStyle w:val="Ttulo2"/>
+        <w:rPr>
+          <w:rFonts w:ascii="Times New Roman" w:eastAsia="Times New Roman" w:hAnsi="Times New Roman" w:cs="Times New Roman"/>
           <w:sz w:val="30"/>
           <w:szCs w:val="30"/>
         </w:rPr>
       </w:pPr>
-    </w:p>
-    <w:p>
-      <w:pPr>
-        <w:pStyle w:val="Ttulo2"/>
+      <w:r>
         <w:rPr>
           <w:rFonts w:ascii="Times New Roman" w:eastAsia="Times New Roman" w:hAnsi="Times New Roman" w:cs="Times New Roman"/>
           <w:sz w:val="30"/>
           <w:szCs w:val="30"/>
         </w:rPr>
-      </w:pPr>
-      <w:r>
-        <w:rPr>
-          <w:rFonts w:ascii="Times New Roman" w:eastAsia="Times New Roman" w:hAnsi="Times New Roman" w:cs="Times New Roman"/>
-          <w:sz w:val="30"/>
-          <w:szCs w:val="30"/>
-        </w:rPr>
+        <w:lastRenderedPageBreak/>
         <w:t>10.</w:t>
       </w:r>
       <w:r>
@@ -26645,7 +26790,7 @@
                     <pic:cNvPicPr/>
                   </pic:nvPicPr>
                   <pic:blipFill rotWithShape="1">
-                    <a:blip r:embed="rId71"/>
+                    <a:blip r:embed="rId72"/>
                     <a:srcRect l="1976" t="4755" r="3481" b="3463"/>
                     <a:stretch>
                       <a:fillRect/>
@@ -26709,7 +26854,7 @@
                     <pic:cNvPicPr/>
                   </pic:nvPicPr>
                   <pic:blipFill rotWithShape="1">
-                    <a:blip r:embed="rId72"/>
+                    <a:blip r:embed="rId73"/>
                     <a:srcRect l="565" t="1820" r="1223" b="1993"/>
                     <a:stretch>
                       <a:fillRect/>
@@ -26747,8 +26892,8 @@
     </w:p>
     <w:p/>
     <w:sectPr>
-      <w:headerReference w:type="default" r:id="rId73"/>
-      <w:footerReference w:type="default" r:id="rId74"/>
+      <w:headerReference w:type="default" r:id="rId74"/>
+      <w:footerReference w:type="default" r:id="rId75"/>
       <w:pgSz w:w="11906" w:h="16838"/>
       <w:pgMar w:top="1417" w:right="1701" w:bottom="1417" w:left="1701" w:header="708" w:footer="708" w:gutter="0"/>
       <w:pgNumType w:start="1"/>

</xml_diff>

<commit_message>
Documentación Entrega 3 (Fechas y cosas mencionadas en correcciones anteriores)
</commit_message>
<xml_diff>
--- a/Documentación/ProyectoIS 2026 CAJAL-FERNANDEZ_3raEntrega.docx
+++ b/Documentación/ProyectoIS 2026 CAJAL-FERNANDEZ_3raEntrega.docx
@@ -7607,20 +7607,8 @@
                 <w:sz w:val="32"/>
                 <w:szCs w:val="32"/>
               </w:rPr>
-              <w:t xml:space="preserve">Entrega </w:t>
-            </w:r>
-            <w:proofErr w:type="spellStart"/>
-            <w:r>
-              <w:rPr>
-                <w:rFonts w:ascii="Times New Roman" w:eastAsia="Times New Roman" w:hAnsi="Times New Roman" w:cs="Times New Roman"/>
-                <w:b/>
-                <w:bCs/>
-                <w:sz w:val="32"/>
-                <w:szCs w:val="32"/>
-              </w:rPr>
-              <w:t>N°</w:t>
-            </w:r>
-            <w:proofErr w:type="spellEnd"/>
+              <w:t>Entrega N°</w:t>
+            </w:r>
           </w:p>
         </w:tc>
         <w:tc>
@@ -7646,20 +7634,8 @@
                 <w:sz w:val="32"/>
                 <w:szCs w:val="32"/>
               </w:rPr>
-              <w:t xml:space="preserve">Versión </w:t>
-            </w:r>
-            <w:proofErr w:type="spellStart"/>
-            <w:r>
-              <w:rPr>
-                <w:rFonts w:ascii="Times New Roman" w:eastAsia="Times New Roman" w:hAnsi="Times New Roman" w:cs="Times New Roman"/>
-                <w:b/>
-                <w:bCs/>
-                <w:sz w:val="32"/>
-                <w:szCs w:val="32"/>
-              </w:rPr>
-              <w:t>N°</w:t>
-            </w:r>
-            <w:proofErr w:type="spellEnd"/>
+              <w:t>Versión N°</w:t>
+            </w:r>
           </w:p>
         </w:tc>
         <w:tc>
@@ -7942,30 +7918,8 @@
               <w:rPr>
                 <w:rFonts w:ascii="Times New Roman" w:eastAsia="Times New Roman" w:hAnsi="Times New Roman" w:cs="Times New Roman"/>
               </w:rPr>
-              <w:t xml:space="preserve">. Cuando quiero modificar un producto que me muestre en los </w:t>
-            </w:r>
-            <w:proofErr w:type="spellStart"/>
-            <w:r>
-              <w:rPr>
-                <w:rFonts w:ascii="Times New Roman" w:eastAsia="Times New Roman" w:hAnsi="Times New Roman" w:cs="Times New Roman"/>
-              </w:rPr>
-              <w:t>textbox</w:t>
-            </w:r>
-            <w:proofErr w:type="spellEnd"/>
-            <w:r>
-              <w:rPr>
-                <w:rFonts w:ascii="Times New Roman" w:eastAsia="Times New Roman" w:hAnsi="Times New Roman" w:cs="Times New Roman"/>
-              </w:rPr>
-              <w:t xml:space="preserve"> todos los datos que ya están – Idem </w:t>
-            </w:r>
-            <w:proofErr w:type="spellStart"/>
-            <w:r>
-              <w:rPr>
-                <w:rFonts w:ascii="Times New Roman" w:eastAsia="Times New Roman" w:hAnsi="Times New Roman" w:cs="Times New Roman"/>
-              </w:rPr>
-              <w:t>frmUsuario</w:t>
-            </w:r>
-            <w:proofErr w:type="spellEnd"/>
+              <w:t>. Cuando quiero modificar un producto que me muestre en los textbox todos los datos que ya están – Idem frmUsuario</w:t>
+            </w:r>
           </w:p>
           <w:p>
             <w:pPr>
@@ -7993,6 +7947,20 @@
                 <w:rFonts w:ascii="Times New Roman" w:eastAsia="Times New Roman" w:hAnsi="Times New Roman" w:cs="Times New Roman"/>
               </w:rPr>
               <w:t>. Control de Cambios: Revertir totalidad de un objeto, no solo de campo</w:t>
+            </w:r>
+          </w:p>
+          <w:p>
+            <w:pPr>
+              <w:jc w:val="center"/>
+              <w:rPr>
+                <w:rFonts w:ascii="Times New Roman" w:eastAsia="Times New Roman" w:hAnsi="Times New Roman" w:cs="Times New Roman"/>
+              </w:rPr>
+            </w:pPr>
+            <w:r>
+              <w:rPr>
+                <w:rFonts w:ascii="Times New Roman" w:eastAsia="Times New Roman" w:hAnsi="Times New Roman" w:cs="Times New Roman"/>
+              </w:rPr>
+              <w:t>. Usuario “Gerente” NO &gt;&gt;&gt; Usuario “Administrador” SI</w:t>
             </w:r>
           </w:p>
         </w:tc>
@@ -8240,17 +8208,8 @@
           <w:rFonts w:ascii="Times New Roman" w:eastAsia="Times New Roman" w:hAnsi="Times New Roman" w:cs="Times New Roman"/>
           <w:color w:val="000000"/>
         </w:rPr>
-        <w:t>Registro/</w:t>
-      </w:r>
-      <w:proofErr w:type="spellStart"/>
-      <w:r>
-        <w:rPr>
-          <w:rFonts w:ascii="Times New Roman" w:eastAsia="Times New Roman" w:hAnsi="Times New Roman" w:cs="Times New Roman"/>
-          <w:color w:val="000000"/>
-        </w:rPr>
-        <w:t>LogIn-Out</w:t>
-      </w:r>
-      <w:proofErr w:type="spellEnd"/>
+        <w:t>Registro/LogIn-Out</w:t>
+      </w:r>
       <w:r>
         <w:rPr>
           <w:rFonts w:ascii="Times New Roman" w:eastAsia="Times New Roman" w:hAnsi="Times New Roman" w:cs="Times New Roman"/>
@@ -8420,28 +8379,12 @@
           <w:rFonts w:ascii="Times New Roman" w:eastAsia="Times New Roman" w:hAnsi="Times New Roman" w:cs="Times New Roman"/>
         </w:rPr>
       </w:pPr>
-      <w:proofErr w:type="spellStart"/>
-      <w:r>
-        <w:rPr>
-          <w:rFonts w:ascii="Times New Roman" w:eastAsia="Times New Roman" w:hAnsi="Times New Roman" w:cs="Times New Roman"/>
-        </w:rPr>
-        <w:t>BackUp</w:t>
-      </w:r>
-      <w:proofErr w:type="spellEnd"/>
-      <w:r>
-        <w:rPr>
-          <w:rFonts w:ascii="Times New Roman" w:eastAsia="Times New Roman" w:hAnsi="Times New Roman" w:cs="Times New Roman"/>
-        </w:rPr>
-        <w:t xml:space="preserve"> y </w:t>
-      </w:r>
-      <w:proofErr w:type="spellStart"/>
-      <w:r>
-        <w:rPr>
-          <w:rFonts w:ascii="Times New Roman" w:eastAsia="Times New Roman" w:hAnsi="Times New Roman" w:cs="Times New Roman"/>
-        </w:rPr>
-        <w:t>Restore</w:t>
-      </w:r>
-      <w:proofErr w:type="spellEnd"/>
+      <w:r>
+        <w:rPr>
+          <w:rFonts w:ascii="Times New Roman" w:eastAsia="Times New Roman" w:hAnsi="Times New Roman" w:cs="Times New Roman"/>
+        </w:rPr>
+        <w:t>BackUp y Restore</w:t>
+      </w:r>
     </w:p>
     <w:p>
       <w:pPr>
@@ -8679,14 +8622,12 @@
                 <w:rFonts w:ascii="Times New Roman" w:hAnsi="Times New Roman" w:cs="Times New Roman"/>
               </w:rPr>
             </w:pPr>
-            <w:proofErr w:type="spellStart"/>
             <w:r>
               <w:rPr>
                 <w:rFonts w:ascii="Times New Roman" w:hAnsi="Times New Roman" w:cs="Times New Roman"/>
               </w:rPr>
               <w:t>Logout</w:t>
             </w:r>
-            <w:proofErr w:type="spellEnd"/>
           </w:p>
         </w:tc>
       </w:tr>
@@ -8755,14 +8696,12 @@
                 <w:rFonts w:ascii="Times New Roman" w:hAnsi="Times New Roman" w:cs="Times New Roman"/>
               </w:rPr>
             </w:pPr>
-            <w:proofErr w:type="spellStart"/>
             <w:r>
               <w:rPr>
                 <w:rFonts w:ascii="Times New Roman" w:hAnsi="Times New Roman" w:cs="Times New Roman"/>
               </w:rPr>
               <w:t>Logout</w:t>
             </w:r>
-            <w:proofErr w:type="spellEnd"/>
           </w:p>
         </w:tc>
       </w:tr>
@@ -10598,55 +10537,7 @@
           <w:rFonts w:ascii="Times New Roman" w:eastAsia="Times New Roman" w:hAnsi="Times New Roman" w:cs="Times New Roman"/>
           <w:color w:val="000000"/>
         </w:rPr>
-        <w:t xml:space="preserve">A su vez en la pantalla del </w:t>
-      </w:r>
-      <w:proofErr w:type="spellStart"/>
-      <w:r>
-        <w:rPr>
-          <w:rFonts w:ascii="Times New Roman" w:eastAsia="Times New Roman" w:hAnsi="Times New Roman" w:cs="Times New Roman"/>
-          <w:color w:val="000000"/>
-        </w:rPr>
-        <w:t>LogIn</w:t>
-      </w:r>
-      <w:proofErr w:type="spellEnd"/>
-      <w:r>
-        <w:rPr>
-          <w:rFonts w:ascii="Times New Roman" w:eastAsia="Times New Roman" w:hAnsi="Times New Roman" w:cs="Times New Roman"/>
-          <w:color w:val="000000"/>
-        </w:rPr>
-        <w:t xml:space="preserve"> presentamos un botón “mostrar” para que si el usuario quiere revisar la contraseña ingresada antes de presionar el botón </w:t>
-      </w:r>
-      <w:proofErr w:type="spellStart"/>
-      <w:r>
-        <w:rPr>
-          <w:rFonts w:ascii="Times New Roman" w:eastAsia="Times New Roman" w:hAnsi="Times New Roman" w:cs="Times New Roman"/>
-          <w:color w:val="000000"/>
-        </w:rPr>
-        <w:t>LogIn</w:t>
-      </w:r>
-      <w:proofErr w:type="spellEnd"/>
-      <w:r>
-        <w:rPr>
-          <w:rFonts w:ascii="Times New Roman" w:eastAsia="Times New Roman" w:hAnsi="Times New Roman" w:cs="Times New Roman"/>
-          <w:color w:val="000000"/>
-        </w:rPr>
-        <w:t xml:space="preserve"> pueda hacerlo. Para ello debemos setear la propiedad </w:t>
-      </w:r>
-      <w:proofErr w:type="spellStart"/>
-      <w:r>
-        <w:rPr>
-          <w:rFonts w:ascii="Times New Roman" w:eastAsia="Times New Roman" w:hAnsi="Times New Roman" w:cs="Times New Roman"/>
-          <w:color w:val="000000"/>
-        </w:rPr>
-        <w:t>PasswordChar</w:t>
-      </w:r>
-      <w:proofErr w:type="spellEnd"/>
-      <w:r>
-        <w:rPr>
-          <w:rFonts w:ascii="Times New Roman" w:eastAsia="Times New Roman" w:hAnsi="Times New Roman" w:cs="Times New Roman"/>
-          <w:color w:val="000000"/>
-        </w:rPr>
-        <w:t xml:space="preserve"> del TextBox en donde el usuario ingresa la contraseña como “*” por default.</w:t>
+        <w:t>A su vez en la pantalla del LogIn presentamos un botón “mostrar” para que si el usuario quiere revisar la contraseña ingresada antes de presionar el botón LogIn pueda hacerlo. Para ello debemos setear la propiedad PasswordChar del TextBox en donde el usuario ingresa la contraseña como “*” por default.</w:t>
       </w:r>
     </w:p>
     <w:p>
@@ -10717,27 +10608,7 @@
           <w:bCs/>
           <w:color w:val="000000"/>
         </w:rPr>
-        <w:t>Proceso de Log-</w:t>
-      </w:r>
-      <w:proofErr w:type="spellStart"/>
-      <w:r>
-        <w:rPr>
-          <w:rFonts w:ascii="Times New Roman" w:eastAsia="Times New Roman" w:hAnsi="Times New Roman" w:cs="Times New Roman"/>
-          <w:b/>
-          <w:bCs/>
-          <w:color w:val="000000"/>
-        </w:rPr>
-        <w:t>Out</w:t>
-      </w:r>
-      <w:proofErr w:type="spellEnd"/>
-      <w:r>
-        <w:rPr>
-          <w:rFonts w:ascii="Times New Roman" w:eastAsia="Times New Roman" w:hAnsi="Times New Roman" w:cs="Times New Roman"/>
-          <w:b/>
-          <w:bCs/>
-          <w:color w:val="000000"/>
-        </w:rPr>
-        <w:t>:</w:t>
+        <w:t>Proceso de Log-Out:</w:t>
       </w:r>
       <w:r>
         <w:rPr>
@@ -10765,37 +10636,9 @@
           <w:szCs w:val="30"/>
         </w:rPr>
         <w:lastRenderedPageBreak/>
-        <w:t xml:space="preserve">2.3 </w:t>
-      </w:r>
-      <w:proofErr w:type="spellStart"/>
-      <w:r>
-        <w:rPr>
-          <w:rFonts w:ascii="Times New Roman" w:eastAsia="Times New Roman" w:hAnsi="Times New Roman" w:cs="Times New Roman"/>
-          <w:sz w:val="30"/>
-          <w:szCs w:val="30"/>
-        </w:rPr>
-        <w:t>LogIn</w:t>
-      </w:r>
-      <w:proofErr w:type="spellEnd"/>
-      <w:r>
-        <w:rPr>
-          <w:rFonts w:ascii="Times New Roman" w:eastAsia="Times New Roman" w:hAnsi="Times New Roman" w:cs="Times New Roman"/>
-          <w:sz w:val="30"/>
-          <w:szCs w:val="30"/>
-        </w:rPr>
-        <w:t xml:space="preserve"> – CU001 </w:t>
-      </w:r>
-      <w:proofErr w:type="spellStart"/>
-      <w:r>
-        <w:rPr>
-          <w:rFonts w:ascii="Times New Roman" w:eastAsia="Times New Roman" w:hAnsi="Times New Roman" w:cs="Times New Roman"/>
-          <w:sz w:val="30"/>
-          <w:szCs w:val="30"/>
-        </w:rPr>
-        <w:t>LogIn</w:t>
+        <w:t>2.3 LogIn – CU001 LogIn</w:t>
       </w:r>
       <w:bookmarkEnd w:id="23"/>
-      <w:proofErr w:type="spellEnd"/>
     </w:p>
     <w:p>
       <w:pPr>
@@ -10821,14 +10664,7 @@
         <w:rPr>
           <w:rFonts w:ascii="Times New Roman" w:eastAsia="Times New Roman" w:hAnsi="Times New Roman" w:cs="Times New Roman"/>
         </w:rPr>
-        <w:t xml:space="preserve"> Diagrama </w:t>
-      </w:r>
-      <w:proofErr w:type="spellStart"/>
-      <w:r>
-        <w:rPr>
-          <w:rFonts w:ascii="Times New Roman" w:eastAsia="Times New Roman" w:hAnsi="Times New Roman" w:cs="Times New Roman"/>
-        </w:rPr>
-        <w:t>LogI</w:t>
+        <w:t xml:space="preserve"> Diagrama LogI</w:t>
       </w:r>
       <w:r>
         <w:rPr>
@@ -10837,7 +10673,6 @@
         <w:t>n</w:t>
       </w:r>
       <w:bookmarkEnd w:id="24"/>
-      <w:proofErr w:type="spellEnd"/>
     </w:p>
     <w:p>
       <w:pPr>
@@ -10980,17 +10815,8 @@
                 <w:rFonts w:ascii="Times New Roman" w:eastAsia="Times New Roman" w:hAnsi="Times New Roman" w:cs="Times New Roman"/>
                 <w:color w:val="000000"/>
               </w:rPr>
-              <w:t xml:space="preserve">CU 001 – </w:t>
-            </w:r>
-            <w:proofErr w:type="spellStart"/>
-            <w:r>
-              <w:rPr>
-                <w:rFonts w:ascii="Times New Roman" w:eastAsia="Times New Roman" w:hAnsi="Times New Roman" w:cs="Times New Roman"/>
-                <w:color w:val="000000"/>
-              </w:rPr>
-              <w:t>LogIn</w:t>
-            </w:r>
-            <w:proofErr w:type="spellEnd"/>
+              <w:t>CU 001 – LogIn</w:t>
+            </w:r>
             <w:r>
               <w:rPr>
                 <w:rFonts w:ascii="Times New Roman" w:eastAsia="Times New Roman" w:hAnsi="Times New Roman" w:cs="Times New Roman"/>
@@ -11405,27 +11231,7 @@
                 <w:sz w:val="22"/>
                 <w:szCs w:val="22"/>
               </w:rPr>
-              <w:t>El usuario ingresa al sistema y se le presenta la pantalla principal del mismo “</w:t>
-            </w:r>
-            <w:proofErr w:type="spellStart"/>
-            <w:r>
-              <w:rPr>
-                <w:rFonts w:ascii="Times New Roman" w:eastAsia="Times New Roman" w:hAnsi="Times New Roman" w:cs="Times New Roman"/>
-                <w:color w:val="000000"/>
-                <w:sz w:val="22"/>
-                <w:szCs w:val="22"/>
-              </w:rPr>
-              <w:t>LogIn</w:t>
-            </w:r>
-            <w:proofErr w:type="spellEnd"/>
-            <w:r>
-              <w:rPr>
-                <w:rFonts w:ascii="Times New Roman" w:eastAsia="Times New Roman" w:hAnsi="Times New Roman" w:cs="Times New Roman"/>
-                <w:color w:val="000000"/>
-                <w:sz w:val="22"/>
-                <w:szCs w:val="22"/>
-              </w:rPr>
-              <w:t>”.</w:t>
+              <w:t>El usuario ingresa al sistema y se le presenta la pantalla principal del mismo “LogIn”.</w:t>
             </w:r>
           </w:p>
           <w:p>
@@ -12003,23 +11809,7 @@
                 <w:rFonts w:ascii="Times New Roman" w:eastAsia="Times New Roman" w:hAnsi="Times New Roman" w:cs="Times New Roman"/>
                 <w:color w:val="000000"/>
               </w:rPr>
-              <w:t xml:space="preserve">El usuario queda autenticado en el sistema e inicia su sesión, se registran los permisos </w:t>
-            </w:r>
-            <w:proofErr w:type="gramStart"/>
-            <w:r>
-              <w:rPr>
-                <w:rFonts w:ascii="Times New Roman" w:eastAsia="Times New Roman" w:hAnsi="Times New Roman" w:cs="Times New Roman"/>
-                <w:color w:val="000000"/>
-              </w:rPr>
-              <w:t>del mismo</w:t>
-            </w:r>
-            <w:proofErr w:type="gramEnd"/>
-            <w:r>
-              <w:rPr>
-                <w:rFonts w:ascii="Times New Roman" w:eastAsia="Times New Roman" w:hAnsi="Times New Roman" w:cs="Times New Roman"/>
-                <w:color w:val="000000"/>
-              </w:rPr>
-              <w:t>.</w:t>
+              <w:t>El usuario queda autenticado en el sistema e inicia su sesión, se registran los permisos del mismo.</w:t>
             </w:r>
           </w:p>
         </w:tc>
@@ -17821,6 +17611,9 @@
     </w:p>
     <w:p>
       <w:r>
+        <w:rPr>
+          <w:noProof/>
+        </w:rPr>
         <w:drawing>
           <wp:inline distT="0" distB="0" distL="0" distR="0" wp14:anchorId="59A0C3B2" wp14:editId="430F383E">
             <wp:extent cx="5400040" cy="2330450"/>
@@ -17984,21 +17777,7 @@
         <w:rPr>
           <w:rFonts w:ascii="Times New Roman" w:hAnsi="Times New Roman" w:cs="Times New Roman"/>
         </w:rPr>
-        <w:t xml:space="preserve">La utilización de la bitácora nos permite llevar un registro de las acciones realizadas dentro del sistema por parte de un usuario </w:t>
-      </w:r>
-      <w:proofErr w:type="gramStart"/>
-      <w:r>
-        <w:rPr>
-          <w:rFonts w:ascii="Times New Roman" w:hAnsi="Times New Roman" w:cs="Times New Roman"/>
-        </w:rPr>
-        <w:t>del mismo</w:t>
-      </w:r>
-      <w:proofErr w:type="gramEnd"/>
-      <w:r>
-        <w:rPr>
-          <w:rFonts w:ascii="Times New Roman" w:hAnsi="Times New Roman" w:cs="Times New Roman"/>
-        </w:rPr>
-        <w:t>. Cada evento registrado en la bitácora va a tener la fecha y hora en la que se realizó, el correo electrónico del usuario de quien la llevo a cabo, la actividad y la información asociada.</w:t>
+        <w:t>La utilización de la bitácora nos permite llevar un registro de las acciones realizadas dentro del sistema por parte de un usuario del mismo. Cada evento registrado en la bitácora va a tener la fecha y hora en la que se realizó, el correo electrónico del usuario de quien la llevo a cabo, la actividad y la información asociada.</w:t>
       </w:r>
     </w:p>
     <w:p>
@@ -18070,21 +17849,7 @@
         <w:rPr>
           <w:rFonts w:ascii="Times New Roman" w:hAnsi="Times New Roman" w:cs="Times New Roman"/>
         </w:rPr>
-        <w:t>Información asociada: Leyenda del hecho (Ej: El usuario “x</w:t>
-      </w:r>
-      <w:proofErr w:type="gramStart"/>
-      <w:r>
-        <w:rPr>
-          <w:rFonts w:ascii="Times New Roman" w:hAnsi="Times New Roman" w:cs="Times New Roman"/>
-        </w:rPr>
-        <w:t>”….</w:t>
-      </w:r>
-      <w:proofErr w:type="gramEnd"/>
-      <w:r>
-        <w:rPr>
-          <w:rFonts w:ascii="Times New Roman" w:hAnsi="Times New Roman" w:cs="Times New Roman"/>
-        </w:rPr>
-        <w:t>. tal actividad)</w:t>
+        <w:t>Información asociada: Leyenda del hecho (Ej: El usuario “x”….. tal actividad)</w:t>
       </w:r>
     </w:p>
     <w:p>
@@ -18589,21 +18354,7 @@
         <w:rPr>
           <w:rFonts w:ascii="Times New Roman" w:hAnsi="Times New Roman" w:cs="Times New Roman"/>
         </w:rPr>
-        <w:t xml:space="preserve">Con el objetivo de garantizar la seguridad de las contraseñas de los usuarios, en este proyecto se aplica el algoritmo SHA-256, encargado de transformar una cadena de texto en un valor de longitud determinado, denominado "hash". Este es un algoritmo de </w:t>
-      </w:r>
-      <w:proofErr w:type="spellStart"/>
-      <w:r>
-        <w:rPr>
-          <w:rFonts w:ascii="Times New Roman" w:hAnsi="Times New Roman" w:cs="Times New Roman"/>
-        </w:rPr>
-        <w:t>hashing</w:t>
-      </w:r>
-      <w:proofErr w:type="spellEnd"/>
-      <w:r>
-        <w:rPr>
-          <w:rFonts w:ascii="Times New Roman" w:hAnsi="Times New Roman" w:cs="Times New Roman"/>
-        </w:rPr>
-        <w:t xml:space="preserve"> unidireccional, lo que significa que no es posible desencriptar el hash para obtener la contraseña original. </w:t>
+        <w:t xml:space="preserve">Con el objetivo de garantizar la seguridad de las contraseñas de los usuarios, en este proyecto se aplica el algoritmo SHA-256, encargado de transformar una cadena de texto en un valor de longitud determinado, denominado "hash". Este es un algoritmo de hashing unidireccional, lo que significa que no es posible desencriptar el hash para obtener la contraseña original. </w:t>
       </w:r>
     </w:p>
     <w:p>
@@ -18616,35 +18367,7 @@
         <w:rPr>
           <w:rFonts w:ascii="Times New Roman" w:hAnsi="Times New Roman" w:cs="Times New Roman"/>
         </w:rPr>
-        <w:t xml:space="preserve">Tanto para la creación de usuarios como para el logueo en el sistema de estos mismos, se deberá ingresar una clave. Esta clave será </w:t>
-      </w:r>
-      <w:proofErr w:type="spellStart"/>
-      <w:r>
-        <w:rPr>
-          <w:rFonts w:ascii="Times New Roman" w:hAnsi="Times New Roman" w:cs="Times New Roman"/>
-        </w:rPr>
-        <w:t>hasheada</w:t>
-      </w:r>
-      <w:proofErr w:type="spellEnd"/>
-      <w:r>
-        <w:rPr>
-          <w:rFonts w:ascii="Times New Roman" w:hAnsi="Times New Roman" w:cs="Times New Roman"/>
-        </w:rPr>
-        <w:t xml:space="preserve"> por el algoritmo SHA-256 y será guardada en la base de datos. Un usuario que requiera iniciar sesión deberá ingresar su clave, en la interfaz de Inicio de sesión, el valor que coloque como clave, al seleccionar “Iniciar Sesión” será </w:t>
-      </w:r>
-      <w:proofErr w:type="spellStart"/>
-      <w:r>
-        <w:rPr>
-          <w:rFonts w:ascii="Times New Roman" w:hAnsi="Times New Roman" w:cs="Times New Roman"/>
-        </w:rPr>
-        <w:t>hasheado</w:t>
-      </w:r>
-      <w:proofErr w:type="spellEnd"/>
-      <w:r>
-        <w:rPr>
-          <w:rFonts w:ascii="Times New Roman" w:hAnsi="Times New Roman" w:cs="Times New Roman"/>
-        </w:rPr>
-        <w:t xml:space="preserve"> y comparado con el valor que se encuentre en la base de datos. Si estos valores coinciden, la sesión es iniciada, en el caso contrario donde no coincidan, se mostrará al usuario un error de contraseña incorrecta. </w:t>
+        <w:t xml:space="preserve">Tanto para la creación de usuarios como para el logueo en el sistema de estos mismos, se deberá ingresar una clave. Esta clave será hasheada por el algoritmo SHA-256 y será guardada en la base de datos. Un usuario que requiera iniciar sesión deberá ingresar su clave, en la interfaz de Inicio de sesión, el valor que coloque como clave, al seleccionar “Iniciar Sesión” será hasheado y comparado con el valor que se encuentre en la base de datos. Si estos valores coinciden, la sesión es iniciada, en el caso contrario donde no coincidan, se mostrará al usuario un error de contraseña incorrecta. </w:t>
       </w:r>
     </w:p>
     <w:p>
@@ -18666,25 +18389,7 @@
           <w:b/>
           <w:bCs/>
         </w:rPr>
-        <w:t xml:space="preserve">Método de la clase </w:t>
-      </w:r>
-      <w:proofErr w:type="spellStart"/>
-      <w:r>
-        <w:rPr>
-          <w:rFonts w:ascii="Times New Roman" w:hAnsi="Times New Roman" w:cs="Times New Roman"/>
-          <w:b/>
-          <w:bCs/>
-        </w:rPr>
-        <w:t>Encriptador</w:t>
-      </w:r>
-      <w:proofErr w:type="spellEnd"/>
-      <w:r>
-        <w:rPr>
-          <w:rFonts w:ascii="Times New Roman" w:hAnsi="Times New Roman" w:cs="Times New Roman"/>
-          <w:b/>
-          <w:bCs/>
-        </w:rPr>
-        <w:t xml:space="preserve">: </w:t>
+        <w:t xml:space="preserve">Método de la clase Encriptador: </w:t>
       </w:r>
     </w:p>
     <w:p>
@@ -18697,21 +18402,7 @@
         <w:rPr>
           <w:rFonts w:ascii="Times New Roman" w:hAnsi="Times New Roman" w:cs="Times New Roman"/>
         </w:rPr>
-        <w:t>Hash (</w:t>
-      </w:r>
-      <w:proofErr w:type="spellStart"/>
-      <w:r>
-        <w:rPr>
-          <w:rFonts w:ascii="Times New Roman" w:hAnsi="Times New Roman" w:cs="Times New Roman"/>
-        </w:rPr>
-        <w:t>string</w:t>
-      </w:r>
-      <w:proofErr w:type="spellEnd"/>
-      <w:r>
-        <w:rPr>
-          <w:rFonts w:ascii="Times New Roman" w:hAnsi="Times New Roman" w:cs="Times New Roman"/>
-        </w:rPr>
-        <w:t xml:space="preserve"> input): Este método toma una cadena de texto (como una contraseña en texto plano) y la convierte en un hash de 256 bits utilizando el algoritmo SHA-256. </w:t>
+        <w:t xml:space="preserve">Hash (string input): Este método toma una cadena de texto (como una contraseña en texto plano) y la convierte en un hash de 256 bits utilizando el algoritmo SHA-256. </w:t>
       </w:r>
     </w:p>
     <w:p>
@@ -18771,21 +18462,7 @@
         <w:rPr>
           <w:rFonts w:ascii="Times New Roman" w:hAnsi="Times New Roman" w:cs="Times New Roman"/>
         </w:rPr>
-        <w:t xml:space="preserve">Al momento de registrar un usuario en el sistema y completar la contraseña de este mismo, en la base de datos el campo que contiene la contraseña no será visible para la persona. Ej: Si la contraseña es Hola123, en la base de datos se </w:t>
-      </w:r>
-      <w:proofErr w:type="spellStart"/>
-      <w:r>
-        <w:rPr>
-          <w:rFonts w:ascii="Times New Roman" w:hAnsi="Times New Roman" w:cs="Times New Roman"/>
-        </w:rPr>
-        <w:t>vera</w:t>
-      </w:r>
-      <w:proofErr w:type="spellEnd"/>
-      <w:r>
-        <w:rPr>
-          <w:rFonts w:ascii="Times New Roman" w:hAnsi="Times New Roman" w:cs="Times New Roman"/>
-        </w:rPr>
-        <w:t xml:space="preserve"> de la siguiente manera: (Imagen ilustrativa de ejemplo)</w:t>
+        <w:t>Al momento de registrar un usuario en el sistema y completar la contraseña de este mismo, en la base de datos el campo que contiene la contraseña no será visible para la persona. Ej: Si la contraseña es Hola123, en la base de datos se vera de la siguiente manera: (Imagen ilustrativa de ejemplo)</w:t>
       </w:r>
     </w:p>
     <w:p>
@@ -23437,6 +23114,9 @@
     </w:p>
     <w:p>
       <w:r>
+        <w:rPr>
+          <w:noProof/>
+        </w:rPr>
         <w:drawing>
           <wp:inline distT="0" distB="0" distL="0" distR="0" wp14:anchorId="0632C101" wp14:editId="7D23B6B0">
             <wp:extent cx="5400040" cy="2267585"/>
@@ -23563,115 +23243,33 @@
         </w:rPr>
         <w:t xml:space="preserve">. El algoritmo realiza una suma ponderada donde cada carácter de cada atributo se multiplica por su posición dentro del valor y por la posición del atributo dentro de la entidad. Esto permite detectar no solo modificaciones en el contenido sino también intercambios de posición entre caracteres o atributos. Los atributos que participan en el cálculo son: </w:t>
       </w:r>
-      <w:proofErr w:type="spellStart"/>
       <w:r>
         <w:rPr>
           <w:rFonts w:ascii="Times New Roman" w:eastAsia="Times New Roman" w:hAnsi="Times New Roman" w:cs="Times New Roman"/>
           <w:color w:val="000000"/>
         </w:rPr>
-        <w:t>IdProducto</w:t>
-      </w:r>
-      <w:proofErr w:type="spellEnd"/>
+        <w:t xml:space="preserve">IdProducto, </w:t>
+      </w:r>
       <w:r>
         <w:rPr>
           <w:rFonts w:ascii="Times New Roman" w:eastAsia="Times New Roman" w:hAnsi="Times New Roman" w:cs="Times New Roman"/>
           <w:color w:val="000000"/>
         </w:rPr>
-        <w:t xml:space="preserve">, </w:t>
-      </w:r>
-      <w:proofErr w:type="spellStart"/>
+        <w:t xml:space="preserve">NombreProducto, PrecioProducto, TipoProducto, </w:t>
+      </w:r>
       <w:r>
         <w:rPr>
           <w:rFonts w:ascii="Times New Roman" w:eastAsia="Times New Roman" w:hAnsi="Times New Roman" w:cs="Times New Roman"/>
           <w:color w:val="000000"/>
         </w:rPr>
-        <w:t>NombreProducto</w:t>
-      </w:r>
-      <w:proofErr w:type="spellEnd"/>
+        <w:t>Descripción</w:t>
+      </w:r>
       <w:r>
         <w:rPr>
           <w:rFonts w:ascii="Times New Roman" w:eastAsia="Times New Roman" w:hAnsi="Times New Roman" w:cs="Times New Roman"/>
           <w:color w:val="000000"/>
         </w:rPr>
-        <w:t xml:space="preserve">, </w:t>
-      </w:r>
-      <w:proofErr w:type="spellStart"/>
-      <w:r>
-        <w:rPr>
-          <w:rFonts w:ascii="Times New Roman" w:eastAsia="Times New Roman" w:hAnsi="Times New Roman" w:cs="Times New Roman"/>
-          <w:color w:val="000000"/>
-        </w:rPr>
-        <w:t>PrecioProducto</w:t>
-      </w:r>
-      <w:proofErr w:type="spellEnd"/>
-      <w:r>
-        <w:rPr>
-          <w:rFonts w:ascii="Times New Roman" w:eastAsia="Times New Roman" w:hAnsi="Times New Roman" w:cs="Times New Roman"/>
-          <w:color w:val="000000"/>
-        </w:rPr>
-        <w:t xml:space="preserve">, </w:t>
-      </w:r>
-      <w:proofErr w:type="spellStart"/>
-      <w:r>
-        <w:rPr>
-          <w:rFonts w:ascii="Times New Roman" w:eastAsia="Times New Roman" w:hAnsi="Times New Roman" w:cs="Times New Roman"/>
-          <w:color w:val="000000"/>
-        </w:rPr>
-        <w:t>TipoProducto</w:t>
-      </w:r>
-      <w:proofErr w:type="spellEnd"/>
-      <w:r>
-        <w:rPr>
-          <w:rFonts w:ascii="Times New Roman" w:eastAsia="Times New Roman" w:hAnsi="Times New Roman" w:cs="Times New Roman"/>
-          <w:color w:val="000000"/>
-        </w:rPr>
-        <w:t xml:space="preserve">, </w:t>
-      </w:r>
-      <w:r>
-        <w:rPr>
-          <w:rFonts w:ascii="Times New Roman" w:eastAsia="Times New Roman" w:hAnsi="Times New Roman" w:cs="Times New Roman"/>
-          <w:color w:val="000000"/>
-        </w:rPr>
-        <w:t>Descripción</w:t>
-      </w:r>
-      <w:r>
-        <w:rPr>
-          <w:rFonts w:ascii="Times New Roman" w:eastAsia="Times New Roman" w:hAnsi="Times New Roman" w:cs="Times New Roman"/>
-          <w:color w:val="000000"/>
-        </w:rPr>
-        <w:t xml:space="preserve">, Cantidad y </w:t>
-      </w:r>
-      <w:proofErr w:type="spellStart"/>
-      <w:r>
-        <w:rPr>
-          <w:rFonts w:ascii="Times New Roman" w:eastAsia="Times New Roman" w:hAnsi="Times New Roman" w:cs="Times New Roman"/>
-          <w:color w:val="000000"/>
-        </w:rPr>
-        <w:t>CodigoProducto</w:t>
-      </w:r>
-      <w:proofErr w:type="spellEnd"/>
-      <w:r>
-        <w:rPr>
-          <w:rFonts w:ascii="Times New Roman" w:eastAsia="Times New Roman" w:hAnsi="Times New Roman" w:cs="Times New Roman"/>
-          <w:color w:val="000000"/>
-        </w:rPr>
-        <w:t xml:space="preserve">. El resultado de la suma se </w:t>
-      </w:r>
-      <w:proofErr w:type="spellStart"/>
-      <w:r>
-        <w:rPr>
-          <w:rFonts w:ascii="Times New Roman" w:eastAsia="Times New Roman" w:hAnsi="Times New Roman" w:cs="Times New Roman"/>
-          <w:color w:val="000000"/>
-        </w:rPr>
-        <w:t>hashea</w:t>
-      </w:r>
-      <w:proofErr w:type="spellEnd"/>
-      <w:r>
-        <w:rPr>
-          <w:rFonts w:ascii="Times New Roman" w:eastAsia="Times New Roman" w:hAnsi="Times New Roman" w:cs="Times New Roman"/>
-          <w:color w:val="000000"/>
-        </w:rPr>
-        <w:t xml:space="preserve"> con SHA-256 y se almacena en la columna DVH de la tabla PRODUCTO.</w:t>
+        <w:t>, Cantidad y CodigoProducto. El resultado de la suma se hashea con SHA-256 y se almacena en la columna DVH de la tabla PRODUCTO.</w:t>
       </w:r>
     </w:p>
     <w:p>
@@ -23693,23 +23291,7 @@
           <w:rFonts w:ascii="Times New Roman" w:eastAsia="Times New Roman" w:hAnsi="Times New Roman" w:cs="Times New Roman"/>
           <w:color w:val="000000"/>
         </w:rPr>
-        <w:t xml:space="preserve">El resultado de la suma se </w:t>
-      </w:r>
-      <w:proofErr w:type="spellStart"/>
-      <w:r>
-        <w:rPr>
-          <w:rFonts w:ascii="Times New Roman" w:eastAsia="Times New Roman" w:hAnsi="Times New Roman" w:cs="Times New Roman"/>
-          <w:color w:val="000000"/>
-        </w:rPr>
-        <w:t>hashea</w:t>
-      </w:r>
-      <w:proofErr w:type="spellEnd"/>
-      <w:r>
-        <w:rPr>
-          <w:rFonts w:ascii="Times New Roman" w:eastAsia="Times New Roman" w:hAnsi="Times New Roman" w:cs="Times New Roman"/>
-          <w:color w:val="000000"/>
-        </w:rPr>
-        <w:t xml:space="preserve"> con SHA-256 y se almacena en la tabla DIGITO_VERIFICADOR. </w:t>
+        <w:t xml:space="preserve">El resultado de la suma se hashea con SHA-256 y se almacena en la tabla DIGITO_VERIFICADOR. </w:t>
       </w:r>
       <w:r>
         <w:rPr>
@@ -23761,39 +23343,7 @@
           <w:rFonts w:ascii="Times New Roman" w:eastAsia="Times New Roman" w:hAnsi="Times New Roman" w:cs="Times New Roman"/>
           <w:color w:val="000000"/>
         </w:rPr>
-        <w:t xml:space="preserve"> suma += ASCII(c) × </w:t>
-      </w:r>
-      <w:proofErr w:type="spellStart"/>
-      <w:r>
-        <w:rPr>
-          <w:rFonts w:ascii="Times New Roman" w:eastAsia="Times New Roman" w:hAnsi="Times New Roman" w:cs="Times New Roman"/>
-          <w:color w:val="000000"/>
-        </w:rPr>
-        <w:t>posChar</w:t>
-      </w:r>
-      <w:proofErr w:type="spellEnd"/>
-      <w:r>
-        <w:rPr>
-          <w:rFonts w:ascii="Times New Roman" w:eastAsia="Times New Roman" w:hAnsi="Times New Roman" w:cs="Times New Roman"/>
-          <w:color w:val="000000"/>
-        </w:rPr>
-        <w:t xml:space="preserve"> × </w:t>
-      </w:r>
-      <w:proofErr w:type="spellStart"/>
-      <w:r>
-        <w:rPr>
-          <w:rFonts w:ascii="Times New Roman" w:eastAsia="Times New Roman" w:hAnsi="Times New Roman" w:cs="Times New Roman"/>
-          <w:color w:val="000000"/>
-        </w:rPr>
-        <w:t>posAtributo</w:t>
-      </w:r>
-      <w:proofErr w:type="spellEnd"/>
-      <w:r>
-        <w:rPr>
-          <w:rFonts w:ascii="Times New Roman" w:eastAsia="Times New Roman" w:hAnsi="Times New Roman" w:cs="Times New Roman"/>
-          <w:color w:val="000000"/>
-        </w:rPr>
-        <w:t xml:space="preserve"> → SHA256(suma)</w:t>
+        <w:t xml:space="preserve"> suma += ASCII(c) × posChar × posAtributo → SHA256(suma)</w:t>
       </w:r>
     </w:p>
     <w:p>
@@ -23822,39 +23372,7 @@
           <w:rFonts w:ascii="Times New Roman" w:eastAsia="Times New Roman" w:hAnsi="Times New Roman" w:cs="Times New Roman"/>
           <w:color w:val="000000"/>
         </w:rPr>
-        <w:t xml:space="preserve"> suma += ASCII(c) × </w:t>
-      </w:r>
-      <w:proofErr w:type="spellStart"/>
-      <w:r>
-        <w:rPr>
-          <w:rFonts w:ascii="Times New Roman" w:eastAsia="Times New Roman" w:hAnsi="Times New Roman" w:cs="Times New Roman"/>
-          <w:color w:val="000000"/>
-        </w:rPr>
-        <w:t>posChar</w:t>
-      </w:r>
-      <w:proofErr w:type="spellEnd"/>
-      <w:r>
-        <w:rPr>
-          <w:rFonts w:ascii="Times New Roman" w:eastAsia="Times New Roman" w:hAnsi="Times New Roman" w:cs="Times New Roman"/>
-          <w:color w:val="000000"/>
-        </w:rPr>
-        <w:t xml:space="preserve"> × </w:t>
-      </w:r>
-      <w:proofErr w:type="spellStart"/>
-      <w:r>
-        <w:rPr>
-          <w:rFonts w:ascii="Times New Roman" w:eastAsia="Times New Roman" w:hAnsi="Times New Roman" w:cs="Times New Roman"/>
-          <w:color w:val="000000"/>
-        </w:rPr>
-        <w:t>posFila</w:t>
-      </w:r>
-      <w:proofErr w:type="spellEnd"/>
-      <w:r>
-        <w:rPr>
-          <w:rFonts w:ascii="Times New Roman" w:eastAsia="Times New Roman" w:hAnsi="Times New Roman" w:cs="Times New Roman"/>
-          <w:color w:val="000000"/>
-        </w:rPr>
-        <w:t xml:space="preserve"> → SHA256(suma)</w:t>
+        <w:t xml:space="preserve"> suma += ASCII(c) × posChar × posFila → SHA256(suma)</w:t>
       </w:r>
     </w:p>
     <w:p>
@@ -23897,41 +23415,7 @@
           <w:rFonts w:ascii="Times New Roman" w:eastAsia="Times New Roman" w:hAnsi="Times New Roman" w:cs="Times New Roman"/>
           <w:color w:val="000000"/>
         </w:rPr>
-        <w:t xml:space="preserve">Al iniciar la aplicación, antes de mostrar el </w:t>
-      </w:r>
-      <w:proofErr w:type="spellStart"/>
-      <w:r>
-        <w:rPr>
-          <w:rFonts w:ascii="Times New Roman" w:eastAsia="Times New Roman" w:hAnsi="Times New Roman" w:cs="Times New Roman"/>
-          <w:color w:val="000000"/>
-        </w:rPr>
-        <w:t>login</w:t>
-      </w:r>
-      <w:proofErr w:type="spellEnd"/>
-      <w:r>
-        <w:rPr>
-          <w:rFonts w:ascii="Times New Roman" w:eastAsia="Times New Roman" w:hAnsi="Times New Roman" w:cs="Times New Roman"/>
-          <w:color w:val="000000"/>
-        </w:rPr>
-        <w:t xml:space="preserve">, se verifican ambos </w:t>
-      </w:r>
-      <w:proofErr w:type="spellStart"/>
-      <w:proofErr w:type="gramStart"/>
-      <w:r>
-        <w:rPr>
-          <w:rFonts w:ascii="Times New Roman" w:eastAsia="Times New Roman" w:hAnsi="Times New Roman" w:cs="Times New Roman"/>
-          <w:color w:val="000000"/>
-        </w:rPr>
-        <w:t>dígitos.En</w:t>
-      </w:r>
-      <w:proofErr w:type="spellEnd"/>
-      <w:proofErr w:type="gramEnd"/>
-      <w:r>
-        <w:rPr>
-          <w:rFonts w:ascii="Times New Roman" w:eastAsia="Times New Roman" w:hAnsi="Times New Roman" w:cs="Times New Roman"/>
-          <w:color w:val="000000"/>
-        </w:rPr>
-        <w:t xml:space="preserve"> caso de error se informa al </w:t>
+        <w:t xml:space="preserve">Al iniciar la aplicación, antes de mostrar el login, se verifican ambos dígitos.En caso de error se informa al </w:t>
       </w:r>
       <w:r>
         <w:rPr>
@@ -24006,23 +23490,7 @@
           <w:rFonts w:ascii="Times New Roman" w:eastAsia="Times New Roman" w:hAnsi="Times New Roman" w:cs="Times New Roman"/>
           <w:color w:val="000000"/>
         </w:rPr>
-        <w:t xml:space="preserve"> Restaura la base de datos completa desde un archivo .</w:t>
-      </w:r>
-      <w:proofErr w:type="spellStart"/>
-      <w:r>
-        <w:rPr>
-          <w:rFonts w:ascii="Times New Roman" w:eastAsia="Times New Roman" w:hAnsi="Times New Roman" w:cs="Times New Roman"/>
-          <w:color w:val="000000"/>
-        </w:rPr>
-        <w:t>bak</w:t>
-      </w:r>
-      <w:proofErr w:type="spellEnd"/>
-      <w:r>
-        <w:rPr>
-          <w:rFonts w:ascii="Times New Roman" w:eastAsia="Times New Roman" w:hAnsi="Times New Roman" w:cs="Times New Roman"/>
-          <w:color w:val="000000"/>
-        </w:rPr>
-        <w:t xml:space="preserve"> generado previamente</w:t>
+        <w:t xml:space="preserve"> Restaura la base de datos completa desde un archivo .bak generado previamente</w:t>
       </w:r>
       <w:r>
         <w:rPr>
@@ -24627,117 +24095,21 @@
           <w:rFonts w:ascii="Times New Roman" w:eastAsia="Times New Roman" w:hAnsi="Times New Roman" w:cs="Times New Roman"/>
           <w:color w:val="000000"/>
         </w:rPr>
-        <w:t xml:space="preserve">El formulario </w:t>
-      </w:r>
-      <w:proofErr w:type="spellStart"/>
+        <w:t xml:space="preserve">El formulario BackUp-Restore permite al </w:t>
+      </w:r>
       <w:r>
         <w:rPr>
           <w:rFonts w:ascii="Times New Roman" w:eastAsia="Times New Roman" w:hAnsi="Times New Roman" w:cs="Times New Roman"/>
           <w:color w:val="000000"/>
         </w:rPr>
-        <w:t>BackUp-Restore</w:t>
-      </w:r>
-      <w:proofErr w:type="spellEnd"/>
+        <w:t>usuario</w:t>
+      </w:r>
       <w:r>
         <w:rPr>
           <w:rFonts w:ascii="Times New Roman" w:eastAsia="Times New Roman" w:hAnsi="Times New Roman" w:cs="Times New Roman"/>
           <w:color w:val="000000"/>
         </w:rPr>
-        <w:t xml:space="preserve"> permite al </w:t>
-      </w:r>
-      <w:r>
-        <w:rPr>
-          <w:rFonts w:ascii="Times New Roman" w:eastAsia="Times New Roman" w:hAnsi="Times New Roman" w:cs="Times New Roman"/>
-          <w:color w:val="000000"/>
-        </w:rPr>
-        <w:t>usuario</w:t>
-      </w:r>
-      <w:r>
-        <w:rPr>
-          <w:rFonts w:ascii="Times New Roman" w:eastAsia="Times New Roman" w:hAnsi="Times New Roman" w:cs="Times New Roman"/>
-          <w:color w:val="000000"/>
-        </w:rPr>
-        <w:t xml:space="preserve"> realizar cuatro operaciones: Crear </w:t>
-      </w:r>
-      <w:proofErr w:type="spellStart"/>
-      <w:r>
-        <w:rPr>
-          <w:rFonts w:ascii="Times New Roman" w:eastAsia="Times New Roman" w:hAnsi="Times New Roman" w:cs="Times New Roman"/>
-          <w:color w:val="000000"/>
-        </w:rPr>
-        <w:t>BackUp</w:t>
-      </w:r>
-      <w:proofErr w:type="spellEnd"/>
-      <w:r>
-        <w:rPr>
-          <w:rFonts w:ascii="Times New Roman" w:eastAsia="Times New Roman" w:hAnsi="Times New Roman" w:cs="Times New Roman"/>
-          <w:color w:val="000000"/>
-        </w:rPr>
-        <w:t xml:space="preserve"> genera un archivo .</w:t>
-      </w:r>
-      <w:proofErr w:type="spellStart"/>
-      <w:r>
-        <w:rPr>
-          <w:rFonts w:ascii="Times New Roman" w:eastAsia="Times New Roman" w:hAnsi="Times New Roman" w:cs="Times New Roman"/>
-          <w:color w:val="000000"/>
-        </w:rPr>
-        <w:t>bak</w:t>
-      </w:r>
-      <w:proofErr w:type="spellEnd"/>
-      <w:r>
-        <w:rPr>
-          <w:rFonts w:ascii="Times New Roman" w:eastAsia="Times New Roman" w:hAnsi="Times New Roman" w:cs="Times New Roman"/>
-          <w:color w:val="000000"/>
-        </w:rPr>
-        <w:t xml:space="preserve"> en la ruta especificada usando el SP </w:t>
-      </w:r>
-      <w:proofErr w:type="spellStart"/>
-      <w:r>
-        <w:rPr>
-          <w:rFonts w:ascii="Times New Roman" w:eastAsia="Times New Roman" w:hAnsi="Times New Roman" w:cs="Times New Roman"/>
-          <w:color w:val="000000"/>
-        </w:rPr>
-        <w:t>RealizarBackup</w:t>
-      </w:r>
-      <w:proofErr w:type="spellEnd"/>
-      <w:r>
-        <w:rPr>
-          <w:rFonts w:ascii="Times New Roman" w:eastAsia="Times New Roman" w:hAnsi="Times New Roman" w:cs="Times New Roman"/>
-          <w:color w:val="000000"/>
-        </w:rPr>
-        <w:t>. Restaurar Base restaura la base de datos completa desde un archivo .</w:t>
-      </w:r>
-      <w:proofErr w:type="spellStart"/>
-      <w:r>
-        <w:rPr>
-          <w:rFonts w:ascii="Times New Roman" w:eastAsia="Times New Roman" w:hAnsi="Times New Roman" w:cs="Times New Roman"/>
-          <w:color w:val="000000"/>
-        </w:rPr>
-        <w:t>bak</w:t>
-      </w:r>
-      <w:proofErr w:type="spellEnd"/>
-      <w:r>
-        <w:rPr>
-          <w:rFonts w:ascii="Times New Roman" w:eastAsia="Times New Roman" w:hAnsi="Times New Roman" w:cs="Times New Roman"/>
-          <w:color w:val="000000"/>
-        </w:rPr>
-        <w:t xml:space="preserve"> usando el SP </w:t>
-      </w:r>
-      <w:proofErr w:type="spellStart"/>
-      <w:r>
-        <w:rPr>
-          <w:rFonts w:ascii="Times New Roman" w:eastAsia="Times New Roman" w:hAnsi="Times New Roman" w:cs="Times New Roman"/>
-          <w:color w:val="000000"/>
-        </w:rPr>
-        <w:t>RealizarRestore</w:t>
-      </w:r>
-      <w:proofErr w:type="spellEnd"/>
-      <w:r>
-        <w:rPr>
-          <w:rFonts w:ascii="Times New Roman" w:eastAsia="Times New Roman" w:hAnsi="Times New Roman" w:cs="Times New Roman"/>
-          <w:color w:val="000000"/>
-        </w:rPr>
-        <w:t>. Ver Error DV ejecuta la verificación de integridad y muestra los errores encontrados. Solucionar Errores recalcula todos los DVH y DVV aceptando los datos actuales.</w:t>
+        <w:t xml:space="preserve"> realizar cuatro operaciones: Crear BackUp genera un archivo .bak en la ruta especificada usando el SP RealizarBackup. Restaurar Base restaura la base de datos completa desde un archivo .bak usando el SP RealizarRestore. Ver Error DV ejecuta la verificación de integridad y muestra los errores encontrados. Solucionar Errores recalcula todos los DVH y DVV aceptando los datos actuales.</w:t>
       </w:r>
     </w:p>
     <w:p>
@@ -24756,36 +24128,14 @@
           <w:color w:val="000000"/>
           <w:lang w:val="en-US"/>
         </w:rPr>
-        <w:t xml:space="preserve">Ruta </w:t>
-      </w:r>
-      <w:proofErr w:type="spellStart"/>
-      <w:r>
-        <w:rPr>
-          <w:rFonts w:ascii="Times New Roman" w:eastAsia="Times New Roman" w:hAnsi="Times New Roman" w:cs="Times New Roman"/>
-          <w:b/>
-          <w:bCs/>
+        <w:t>Ruta recomendada para backup:</w:t>
+      </w:r>
+      <w:r>
+        <w:rPr>
+          <w:rFonts w:ascii="Times New Roman" w:eastAsia="Times New Roman" w:hAnsi="Times New Roman" w:cs="Times New Roman"/>
           <w:color w:val="000000"/>
           <w:lang w:val="en-US"/>
         </w:rPr>
-        <w:t>recomendada</w:t>
-      </w:r>
-      <w:proofErr w:type="spellEnd"/>
-      <w:r>
-        <w:rPr>
-          <w:rFonts w:ascii="Times New Roman" w:eastAsia="Times New Roman" w:hAnsi="Times New Roman" w:cs="Times New Roman"/>
-          <w:b/>
-          <w:bCs/>
-          <w:color w:val="000000"/>
-          <w:lang w:val="en-US"/>
-        </w:rPr>
-        <w:t xml:space="preserve"> para backup:</w:t>
-      </w:r>
-      <w:r>
-        <w:rPr>
-          <w:rFonts w:ascii="Times New Roman" w:eastAsia="Times New Roman" w:hAnsi="Times New Roman" w:cs="Times New Roman"/>
-          <w:color w:val="000000"/>
-          <w:lang w:val="en-US"/>
-        </w:rPr>
         <w:t xml:space="preserve"> </w:t>
       </w:r>
       <w:r>
@@ -24794,18 +24144,8 @@
           <w:color w:val="0066FF"/>
           <w:lang w:val="en-US"/>
         </w:rPr>
-        <w:t>C:\Program Files\Microsoft SQL Server\MSSQL15.SQLEXPRESS\MSSQL\Backup\</w:t>
-      </w:r>
-      <w:proofErr w:type="spellStart"/>
-      <w:r>
-        <w:rPr>
-          <w:rFonts w:ascii="Times New Roman" w:eastAsia="Times New Roman" w:hAnsi="Times New Roman" w:cs="Times New Roman"/>
-          <w:color w:val="0066FF"/>
-          <w:lang w:val="en-US"/>
-        </w:rPr>
-        <w:t>NombreArchivo.bak</w:t>
-      </w:r>
-      <w:proofErr w:type="spellEnd"/>
+        <w:t>C:\Program Files\Microsoft SQL Server\MSSQL15.SQLEXPRESS\MSSQL\Backup\NombreArchivo.bak</w:t>
+      </w:r>
     </w:p>
     <w:p>
       <w:pPr>
@@ -24949,7 +24289,6 @@
           <w:bCs/>
         </w:rPr>
       </w:pPr>
-      <w:proofErr w:type="spellStart"/>
       <w:r>
         <w:rPr>
           <w:b/>
@@ -24958,7 +24297,6 @@
         <w:lastRenderedPageBreak/>
         <w:t>Restore</w:t>
       </w:r>
-      <w:proofErr w:type="spellEnd"/>
     </w:p>
     <w:p>
       <w:r>
@@ -25069,27 +24407,11 @@
       <w:r>
         <w:t xml:space="preserve">lase base que define la interfaz común para permisos atómicos y compuestos. Contiene el método </w:t>
       </w:r>
-      <w:proofErr w:type="spellStart"/>
-      <w:proofErr w:type="gramStart"/>
       <w:r>
         <w:rPr>
           <w:rStyle w:val="CdigoHTML"/>
         </w:rPr>
-        <w:t>ContienePermiso</w:t>
-      </w:r>
-      <w:proofErr w:type="spellEnd"/>
-      <w:r>
-        <w:rPr>
-          <w:rStyle w:val="CdigoHTML"/>
-        </w:rPr>
-        <w:t>(</w:t>
-      </w:r>
-      <w:proofErr w:type="gramEnd"/>
-      <w:r>
-        <w:rPr>
-          <w:rStyle w:val="CdigoHTML"/>
-        </w:rPr>
-        <w:t>)</w:t>
+        <w:t>ContienePermiso()</w:t>
       </w:r>
       <w:r>
         <w:t xml:space="preserve"> que recorre recursivamente la jerarquía para verificar si un permiso existe dentro de la estructura.</w:t>
@@ -25116,23 +24438,7 @@
         <w:t>H</w:t>
       </w:r>
       <w:r>
-        <w:t>oja del árbol. Representa un permiso funcional específico del sistema (ej: "</w:t>
-      </w:r>
-      <w:proofErr w:type="spellStart"/>
-      <w:r>
-        <w:t>Gestion</w:t>
-      </w:r>
-      <w:proofErr w:type="spellEnd"/>
-      <w:r>
-        <w:t xml:space="preserve"> Usuarios", "</w:t>
-      </w:r>
-      <w:proofErr w:type="spellStart"/>
-      <w:r>
-        <w:t>Gestion</w:t>
-      </w:r>
-      <w:proofErr w:type="spellEnd"/>
-      <w:r>
-        <w:t xml:space="preserve"> Productos"). No puede tener hijos. Sus instancias están precargadas en la base de datos y no pueden ser creadas desde la interfaz.</w:t>
+        <w:t>oja del árbol. Representa un permiso funcional específico del sistema (ej: "Gestion Usuarios", "Gestion Productos"). No puede tener hijos. Sus instancias están precargadas en la base de datos y no pueden ser creadas desde la interfaz.</w:t>
       </w:r>
     </w:p>
     <w:p>
@@ -25157,41 +24463,7 @@
         <w:t>N</w:t>
       </w:r>
       <w:r>
-        <w:t xml:space="preserve">odo interno del árbol. Representa un rol que puede contener tanto permisos atómicos como otros roles. Tiene una lista de </w:t>
-      </w:r>
-      <w:proofErr w:type="spellStart"/>
-      <w:r>
-        <w:t>PermisosIncluidos</w:t>
-      </w:r>
-      <w:proofErr w:type="spellEnd"/>
-      <w:r>
-        <w:t xml:space="preserve"> y los métodos </w:t>
-      </w:r>
-      <w:proofErr w:type="spellStart"/>
-      <w:proofErr w:type="gramStart"/>
-      <w:r>
-        <w:t>AgregarPermiso</w:t>
-      </w:r>
-      <w:proofErr w:type="spellEnd"/>
-      <w:r>
-        <w:t>(</w:t>
-      </w:r>
-      <w:proofErr w:type="gramEnd"/>
-      <w:r>
-        <w:t xml:space="preserve">) y </w:t>
-      </w:r>
-      <w:proofErr w:type="spellStart"/>
-      <w:proofErr w:type="gramStart"/>
-      <w:r>
-        <w:t>QuitarPermiso</w:t>
-      </w:r>
-      <w:proofErr w:type="spellEnd"/>
-      <w:r>
-        <w:t>(</w:t>
-      </w:r>
-      <w:proofErr w:type="gramEnd"/>
-      <w:r>
-        <w:t>).</w:t>
+        <w:t>odo interno del árbol. Representa un rol que puede contener tanto permisos atómicos como otros roles. Tiene una lista de PermisosIncluidos y los métodos AgregarPermiso() y QuitarPermiso().</w:t>
       </w:r>
     </w:p>
     <w:p>
@@ -25530,7 +24802,6 @@
         </w:rPr>
         <w:t xml:space="preserve"> </w:t>
       </w:r>
-      <w:proofErr w:type="spellStart"/>
       <w:r>
         <w:rPr>
           <w:rFonts w:ascii="Times New Roman" w:hAnsi="Times New Roman" w:cs="Times New Roman"/>
@@ -25538,7 +24809,6 @@
         </w:rPr>
         <w:t>river</w:t>
       </w:r>
-      <w:proofErr w:type="spellEnd"/>
     </w:p>
     <w:p>
       <w:pPr>
@@ -25580,7 +24850,6 @@
         </w:rPr>
         <w:t xml:space="preserve"> contraseña: </w:t>
       </w:r>
-      <w:proofErr w:type="spellStart"/>
       <w:r>
         <w:rPr>
           <w:rFonts w:ascii="Times New Roman" w:hAnsi="Times New Roman" w:cs="Times New Roman"/>
@@ -25588,7 +24857,6 @@
         </w:rPr>
         <w:t>rojoave</w:t>
       </w:r>
-      <w:proofErr w:type="spellEnd"/>
     </w:p>
     <w:p>
       <w:pPr>
@@ -27384,23 +26652,7 @@
                 <w:rFonts w:asciiTheme="majorBidi" w:hAnsiTheme="majorBidi" w:cstheme="majorBidi"/>
                 <w:lang w:val="es-ES"/>
               </w:rPr>
-              <w:t xml:space="preserve"> El sistema muestra el nombre del control entre corchetes como </w:t>
-            </w:r>
-            <w:proofErr w:type="spellStart"/>
-            <w:r>
-              <w:rPr>
-                <w:rFonts w:asciiTheme="majorBidi" w:hAnsiTheme="majorBidi" w:cstheme="majorBidi"/>
-                <w:lang w:val="es-ES"/>
-              </w:rPr>
-              <w:t>fallback</w:t>
-            </w:r>
-            <w:proofErr w:type="spellEnd"/>
-            <w:r>
-              <w:rPr>
-                <w:rFonts w:asciiTheme="majorBidi" w:hAnsiTheme="majorBidi" w:cstheme="majorBidi"/>
-                <w:lang w:val="es-ES"/>
-              </w:rPr>
-              <w:t xml:space="preserve">. </w:t>
+              <w:t xml:space="preserve"> El sistema muestra el nombre del control entre corchetes como fallback. </w:t>
             </w:r>
             <w:r>
               <w:rPr>
@@ -27468,23 +26720,7 @@
                 <w:rFonts w:asciiTheme="majorBidi" w:hAnsiTheme="majorBidi" w:cstheme="majorBidi"/>
                 <w:lang w:val="es-ES"/>
               </w:rPr>
-              <w:t xml:space="preserve"> El sistema utiliza el texto en español entre corchetes como </w:t>
-            </w:r>
-            <w:proofErr w:type="spellStart"/>
-            <w:r>
-              <w:rPr>
-                <w:rFonts w:asciiTheme="majorBidi" w:hAnsiTheme="majorBidi" w:cstheme="majorBidi"/>
-                <w:lang w:val="es-ES"/>
-              </w:rPr>
-              <w:t>fallback</w:t>
-            </w:r>
-            <w:proofErr w:type="spellEnd"/>
-            <w:r>
-              <w:rPr>
-                <w:rFonts w:asciiTheme="majorBidi" w:hAnsiTheme="majorBidi" w:cstheme="majorBidi"/>
-                <w:lang w:val="es-ES"/>
-              </w:rPr>
-              <w:t xml:space="preserve"> según el COALESCE definido en la base de datos.</w:t>
+              <w:t xml:space="preserve"> El sistema utiliza el texto en español entre corchetes como fallback según el COALESCE definido en la base de datos.</w:t>
             </w:r>
             <w:r>
               <w:rPr>
@@ -27819,6 +27055,7 @@
       <w:r>
         <w:rPr>
           <w:rFonts w:ascii="Times New Roman" w:eastAsia="Times New Roman" w:hAnsi="Times New Roman" w:cs="Times New Roman"/>
+          <w:noProof/>
         </w:rPr>
         <w:drawing>
           <wp:inline distT="0" distB="0" distL="0" distR="0" wp14:anchorId="1BE83B61" wp14:editId="188BFBF4">
@@ -28392,7 +27629,7 @@
             <w:rPr>
               <w:color w:val="000000"/>
             </w:rPr>
-            <w:t>25</w:t>
+            <w:t>03</w:t>
           </w:r>
           <w:r>
             <w:rPr>
@@ -28404,7 +27641,7 @@
             <w:rPr>
               <w:color w:val="000000"/>
             </w:rPr>
-            <w:t>6</w:t>
+            <w:t>7</w:t>
           </w:r>
           <w:r>
             <w:rPr>

</xml_diff>

<commit_message>
Doc con pantalla frmUsu modificada
</commit_message>
<xml_diff>
--- a/Documentación/ProyectoIS 2026 CAJAL-FERNANDEZ_3raEntrega.docx
+++ b/Documentación/ProyectoIS 2026 CAJAL-FERNANDEZ_3raEntrega.docx
@@ -17611,14 +17611,11 @@
     </w:p>
     <w:p>
       <w:r>
-        <w:rPr>
-          <w:noProof/>
-        </w:rPr>
         <w:drawing>
-          <wp:inline distT="0" distB="0" distL="0" distR="0" wp14:anchorId="59A0C3B2" wp14:editId="430F383E">
-            <wp:extent cx="5400040" cy="2330450"/>
-            <wp:effectExtent l="0" t="0" r="0" b="0"/>
-            <wp:docPr id="2081441043" name="Imagen 1"/>
+          <wp:inline distT="0" distB="0" distL="0" distR="0" wp14:anchorId="64CEF9CE" wp14:editId="578E4911">
+            <wp:extent cx="5400040" cy="2356485"/>
+            <wp:effectExtent l="0" t="0" r="0" b="5715"/>
+            <wp:docPr id="909706740" name="Imagen 1"/>
             <wp:cNvGraphicFramePr>
               <a:graphicFrameLocks xmlns:a="http://schemas.openxmlformats.org/drawingml/2006/main" noChangeAspect="1"/>
             </wp:cNvGraphicFramePr>
@@ -17626,7 +17623,7 @@
               <a:graphicData uri="http://schemas.openxmlformats.org/drawingml/2006/picture">
                 <pic:pic xmlns:pic="http://schemas.openxmlformats.org/drawingml/2006/picture">
                   <pic:nvPicPr>
-                    <pic:cNvPr id="2081441043" name=""/>
+                    <pic:cNvPr id="909706740" name=""/>
                     <pic:cNvPicPr/>
                   </pic:nvPicPr>
                   <pic:blipFill>
@@ -17638,7 +17635,7 @@
                   <pic:spPr>
                     <a:xfrm>
                       <a:off x="0" y="0"/>
-                      <a:ext cx="5400040" cy="2330450"/>
+                      <a:ext cx="5400040" cy="2356485"/>
                     </a:xfrm>
                     <a:prstGeom prst="rect">
                       <a:avLst/>

</xml_diff>